<commit_message>
Add OS-specific troubleshooting across installation runbooks.
Expand Tanium guide with Linux/Windows diagnostic commands and symptom
tables; add Troubleshooting sections to automation, cloud, and K8s docs.

Co-authored-by: Cursor <cursoragent@cursor.com>
</commit_message>
<xml_diff>
--- a/tanium/TANIUM-DEPLOYMENT-CHECKLIST.docx
+++ b/tanium/TANIUM-DEPLOYMENT-CHECKLIST.docx
@@ -1535,13 +1535,22 @@
       </w:r>
     </w:p>
     <w:bookmarkEnd w:id="15"/>
-    <w:bookmarkStart w:id="17" w:name="if-something-fails"/>
+    <w:bookmarkStart w:id="21" w:name="if-something-fails"/>
     <w:p>
       <w:pPr>
         <w:pStyle w:val="Heading2"/>
       </w:pPr>
       <w:r>
         <w:t xml:space="preserve">If something fails</w:t>
+      </w:r>
+    </w:p>
+    <w:bookmarkStart w:id="16" w:name="all-platforms-tanium"/>
+    <w:p>
+      <w:pPr>
+        <w:pStyle w:val="Heading3"/>
+      </w:pPr>
+      <w:r>
+        <w:t xml:space="preserve">All platforms (Tanium)</w:t>
       </w:r>
     </w:p>
     <w:tbl>
@@ -1620,7 +1629,7 @@
               <w:pStyle w:val="Compact"/>
             </w:pPr>
             <w:r>
-              <w:t xml:space="preserve">Verify</w:t>
+              <w:t xml:space="preserve">Confirm</w:t>
             </w:r>
             <w:r>
               <w:t xml:space="preserve"> </w:t>
@@ -1630,6 +1639,21 @@
                 <w:rStyle w:val="VerbatimChar"/>
               </w:rPr>
               <w:t xml:space="preserve">user.cfg</w:t>
+            </w:r>
+            <w:r>
+              <w:t xml:space="preserve"> </w:t>
+            </w:r>
+            <w:r>
+              <w:t xml:space="preserve">with valid</w:t>
+            </w:r>
+            <w:r>
+              <w:t xml:space="preserve"> </w:t>
+            </w:r>
+            <w:r>
+              <w:rPr>
+                <w:rStyle w:val="VerbatimChar"/>
+              </w:rPr>
+              <w:t xml:space="preserve">ACTIVATION_KEY</w:t>
             </w:r>
             <w:r>
               <w:t xml:space="preserve"> </w:t>
@@ -1651,46 +1675,31 @@
               <w:t xml:space="preserve"> </w:t>
             </w:r>
             <w:r>
-              <w:t xml:space="preserve">install; regenerate key in CSW UI if rotated</w:t>
-            </w:r>
-          </w:p>
-        </w:tc>
-      </w:tr>
-      <w:tr>
-        <w:tc>
-          <w:tcPr/>
-          <w:p>
-            <w:pPr>
-              <w:pStyle w:val="Compact"/>
-            </w:pPr>
-            <w:r>
-              <w:t xml:space="preserve">TLS / certificate errors</w:t>
-            </w:r>
-          </w:p>
-        </w:tc>
-        <w:tc>
-          <w:tcPr/>
-          <w:p>
-            <w:pPr>
-              <w:pStyle w:val="Compact"/>
-            </w:pPr>
-            <w:r>
-              <w:t xml:space="preserve">Re-ship full bundle; confirm</w:t>
-            </w:r>
-            <w:r>
-              <w:t xml:space="preserve"> </w:t>
-            </w:r>
-            <w:r>
-              <w:rPr>
-                <w:rStyle w:val="VerbatimChar"/>
-              </w:rPr>
-              <w:t xml:space="preserve">ca.cert</w:t>
-            </w:r>
-            <w:r>
-              <w:t xml:space="preserve"> </w:t>
-            </w:r>
-            <w:r>
-              <w:t xml:space="preserve">from</w:t>
+              <w:t xml:space="preserve">install step ran</w:t>
+            </w:r>
+          </w:p>
+        </w:tc>
+      </w:tr>
+      <w:tr>
+        <w:tc>
+          <w:tcPr/>
+          <w:p>
+            <w:pPr>
+              <w:pStyle w:val="Compact"/>
+            </w:pPr>
+            <w:r>
+              <w:t xml:space="preserve">Package step order wrong</w:t>
+            </w:r>
+          </w:p>
+        </w:tc>
+        <w:tc>
+          <w:tcPr/>
+          <w:p>
+            <w:pPr>
+              <w:pStyle w:val="Compact"/>
+            </w:pPr>
+            <w:r>
+              <w:t xml:space="preserve">Rebuild package:</w:t>
             </w:r>
             <w:r>
               <w:t xml:space="preserve"> </w:t>
@@ -1700,45 +1709,423 @@
                 <w:b/>
                 <w:bCs/>
               </w:rPr>
-              <w:t xml:space="preserve">this</w:t>
-            </w:r>
-            <w:r>
-              <w:t xml:space="preserve"> </w:t>
-            </w:r>
-            <w:r>
-              <w:t xml:space="preserve">cluster</w:t>
-            </w:r>
-          </w:p>
-        </w:tc>
-      </w:tr>
-      <w:tr>
-        <w:tc>
-          <w:tcPr/>
-          <w:p>
-            <w:pPr>
-              <w:pStyle w:val="Compact"/>
-            </w:pPr>
-            <w:r>
-              <w:t xml:space="preserve">Proxy errors</w:t>
-            </w:r>
-          </w:p>
-        </w:tc>
-        <w:tc>
-          <w:tcPr/>
-          <w:p>
-            <w:pPr>
-              <w:pStyle w:val="Compact"/>
-            </w:pPr>
-            <w:r>
-              <w:t xml:space="preserve">Add</w:t>
-            </w:r>
-            <w:r>
-              <w:t xml:space="preserve"> </w:t>
-            </w:r>
+              <w:t xml:space="preserve">(1) stage user.cfg → (2) deploy bundle → (3) install</w:t>
+            </w:r>
+          </w:p>
+        </w:tc>
+      </w:tr>
+      <w:tr>
+        <w:tc>
+          <w:tcPr/>
+          <w:p>
+            <w:pPr>
+              <w:pStyle w:val="Compact"/>
+            </w:pPr>
+            <w:r>
+              <w:t xml:space="preserve">Key in Tanium variable empty</w:t>
+            </w:r>
+          </w:p>
+        </w:tc>
+        <w:tc>
+          <w:tcPr/>
+          <w:p>
+            <w:pPr>
+              <w:pStyle w:val="Compact"/>
+            </w:pPr>
+            <w:r>
+              <w:t xml:space="preserve">Fix secret variable binding; pilot on one host before fleet</w:t>
+            </w:r>
+          </w:p>
+        </w:tc>
+      </w:tr>
+    </w:tbl>
+    <w:bookmarkEnd w:id="16"/>
+    <w:bookmarkStart w:id="17" w:name="linux"/>
+    <w:p>
+      <w:pPr>
+        <w:pStyle w:val="Heading3"/>
+      </w:pPr>
+      <w:r>
+        <w:t xml:space="preserve">Linux</w:t>
+      </w:r>
+    </w:p>
+    <w:tbl>
+      <w:tblPr>
+        <w:tblStyle w:val="Table"/>
+        <w:tblW w:type="auto" w:w="0"/>
+        <w:tblLook w:firstRow="1" w:lastRow="0" w:firstColumn="0" w:lastColumn="0" w:noHBand="0" w:noVBand="0" w:val="0020"/>
+      </w:tblPr>
+      <w:tblGrid>
+        <w:gridCol w:w="3960"/>
+        <w:gridCol w:w="3960"/>
+      </w:tblGrid>
+      <w:tr>
+        <w:trPr>
+          <w:tblHeader w:val="on"/>
+        </w:trPr>
+        <w:tc>
+          <w:tcPr/>
+          <w:p>
+            <w:pPr>
+              <w:pStyle w:val="Compact"/>
+            </w:pPr>
+            <w:r>
+              <w:t xml:space="preserve">Symptom</w:t>
+            </w:r>
+          </w:p>
+        </w:tc>
+        <w:tc>
+          <w:tcPr/>
+          <w:p>
+            <w:pPr>
+              <w:pStyle w:val="Compact"/>
+            </w:pPr>
+            <w:r>
+              <w:t xml:space="preserve">First action</w:t>
+            </w:r>
+          </w:p>
+        </w:tc>
+      </w:tr>
+      <w:tr>
+        <w:tc>
+          <w:tcPr/>
+          <w:p>
+            <w:pPr>
+              <w:pStyle w:val="Compact"/>
+            </w:pPr>
+            <w:r>
+              <w:t xml:space="preserve">Install fails immediately</w:t>
+            </w:r>
+          </w:p>
+        </w:tc>
+        <w:tc>
+          <w:tcPr/>
+          <w:p>
+            <w:pPr>
+              <w:pStyle w:val="Compact"/>
+            </w:pPr>
             <w:r>
               <w:rPr>
                 <w:rStyle w:val="VerbatimChar"/>
               </w:rPr>
+              <w:t xml:space="preserve">journalctl -u csw-agent -n 50</w:t>
+            </w:r>
+            <w:r>
+              <w:t xml:space="preserve">; confirm</w:t>
+            </w:r>
+            <w:r>
+              <w:t xml:space="preserve"> </w:t>
+            </w:r>
+            <w:r>
+              <w:rPr>
+                <w:rStyle w:val="VerbatimChar"/>
+              </w:rPr>
+              <w:t xml:space="preserve">user.cfg</w:t>
+            </w:r>
+            <w:r>
+              <w:t xml:space="preserve"> </w:t>
+            </w:r>
+            <w:r>
+              <w:t xml:space="preserve">at</w:t>
+            </w:r>
+            <w:r>
+              <w:t xml:space="preserve"> </w:t>
+            </w:r>
+            <w:r>
+              <w:rPr>
+                <w:rStyle w:val="VerbatimChar"/>
+              </w:rPr>
+              <w:t xml:space="preserve">/opt/tanium/csw/</w:t>
+            </w:r>
+          </w:p>
+        </w:tc>
+      </w:tr>
+      <w:tr>
+        <w:tc>
+          <w:tcPr/>
+          <w:p>
+            <w:pPr>
+              <w:pStyle w:val="Compact"/>
+            </w:pPr>
+            <w:r>
+              <w:t xml:space="preserve">TLS / cert errors</w:t>
+            </w:r>
+          </w:p>
+        </w:tc>
+        <w:tc>
+          <w:tcPr/>
+          <w:p>
+            <w:pPr>
+              <w:pStyle w:val="Compact"/>
+            </w:pPr>
+            <w:r>
+              <w:t xml:space="preserve">Re-ship</w:t>
+            </w:r>
+            <w:r>
+              <w:t xml:space="preserve"> </w:t>
+            </w:r>
+            <w:r>
+              <w:rPr>
+                <w:rStyle w:val="VerbatimChar"/>
+              </w:rPr>
+              <w:t xml:space="preserve">ca.cert</w:t>
+            </w:r>
+            <w:r>
+              <w:t xml:space="preserve"> </w:t>
+            </w:r>
+            <w:r>
+              <w:t xml:space="preserve">+ full bundle from CSW UI</w:t>
+            </w:r>
+          </w:p>
+        </w:tc>
+      </w:tr>
+      <w:tr>
+        <w:tc>
+          <w:tcPr/>
+          <w:p>
+            <w:pPr>
+              <w:pStyle w:val="Compact"/>
+            </w:pPr>
+            <w:r>
+              <w:t xml:space="preserve">Service won't start</w:t>
+            </w:r>
+          </w:p>
+        </w:tc>
+        <w:tc>
+          <w:tcPr/>
+          <w:p>
+            <w:pPr>
+              <w:pStyle w:val="Compact"/>
+            </w:pPr>
+            <w:r>
+              <w:t xml:space="preserve">Check kernel-devel match:</w:t>
+            </w:r>
+            <w:r>
+              <w:t xml:space="preserve"> </w:t>
+            </w:r>
+            <w:r>
+              <w:rPr>
+                <w:rStyle w:val="VerbatimChar"/>
+              </w:rPr>
+              <w:t xml:space="preserve">uname -r</w:t>
+            </w:r>
+            <w:r>
+              <w:t xml:space="preserve">; check SELinux AVC denials</w:t>
+            </w:r>
+          </w:p>
+        </w:tc>
+      </w:tr>
+      <w:tr>
+        <w:tc>
+          <w:tcPr/>
+          <w:p>
+            <w:pPr>
+              <w:pStyle w:val="Compact"/>
+            </w:pPr>
+            <w:r>
+              <w:t xml:space="preserve">Network timeout</w:t>
+            </w:r>
+          </w:p>
+        </w:tc>
+        <w:tc>
+          <w:tcPr/>
+          <w:p>
+            <w:pPr>
+              <w:pStyle w:val="Compact"/>
+            </w:pPr>
+            <w:r>
+              <w:rPr>
+                <w:rStyle w:val="VerbatimChar"/>
+              </w:rPr>
+              <w:t xml:space="preserve">nc -zv &lt;cluster&gt; 443</w:t>
+            </w:r>
+            <w:r>
+              <w:t xml:space="preserve">; open firewall per network prereq doc</w:t>
+            </w:r>
+          </w:p>
+        </w:tc>
+      </w:tr>
+    </w:tbl>
+    <w:bookmarkEnd w:id="17"/>
+    <w:bookmarkStart w:id="20" w:name="windows"/>
+    <w:p>
+      <w:pPr>
+        <w:pStyle w:val="Heading3"/>
+      </w:pPr>
+      <w:r>
+        <w:t xml:space="preserve">Windows</w:t>
+      </w:r>
+    </w:p>
+    <w:tbl>
+      <w:tblPr>
+        <w:tblStyle w:val="Table"/>
+        <w:tblW w:type="auto" w:w="0"/>
+        <w:tblLook w:firstRow="1" w:lastRow="0" w:firstColumn="0" w:lastColumn="0" w:noHBand="0" w:noVBand="0" w:val="0020"/>
+      </w:tblPr>
+      <w:tblGrid>
+        <w:gridCol w:w="3960"/>
+        <w:gridCol w:w="3960"/>
+      </w:tblGrid>
+      <w:tr>
+        <w:trPr>
+          <w:tblHeader w:val="on"/>
+        </w:trPr>
+        <w:tc>
+          <w:tcPr/>
+          <w:p>
+            <w:pPr>
+              <w:pStyle w:val="Compact"/>
+            </w:pPr>
+            <w:r>
+              <w:t xml:space="preserve">Symptom</w:t>
+            </w:r>
+          </w:p>
+        </w:tc>
+        <w:tc>
+          <w:tcPr/>
+          <w:p>
+            <w:pPr>
+              <w:pStyle w:val="Compact"/>
+            </w:pPr>
+            <w:r>
+              <w:t xml:space="preserve">First action</w:t>
+            </w:r>
+          </w:p>
+        </w:tc>
+      </w:tr>
+      <w:tr>
+        <w:tc>
+          <w:tcPr/>
+          <w:p>
+            <w:pPr>
+              <w:pStyle w:val="Compact"/>
+            </w:pPr>
+            <w:r>
+              <w:t xml:space="preserve">MSI failure</w:t>
+            </w:r>
+          </w:p>
+        </w:tc>
+        <w:tc>
+          <w:tcPr/>
+          <w:p>
+            <w:pPr>
+              <w:pStyle w:val="Compact"/>
+            </w:pPr>
+            <w:r>
+              <w:t xml:space="preserve">Open</w:t>
+            </w:r>
+            <w:r>
+              <w:t xml:space="preserve"> </w:t>
+            </w:r>
+            <w:r>
+              <w:rPr>
+                <w:rStyle w:val="VerbatimChar"/>
+              </w:rPr>
+              <w:t xml:space="preserve">%TEMP%\csw-agent-tanium-install.log</w:t>
+            </w:r>
+            <w:r>
+              <w:t xml:space="preserve">; search</w:t>
+            </w:r>
+            <w:r>
+              <w:t xml:space="preserve"> </w:t>
+            </w:r>
+            <w:r>
+              <w:rPr>
+                <w:rStyle w:val="VerbatimChar"/>
+              </w:rPr>
+              <w:t xml:space="preserve">Return value 3</w:t>
+            </w:r>
+          </w:p>
+        </w:tc>
+      </w:tr>
+      <w:tr>
+        <w:tc>
+          <w:tcPr/>
+          <w:p>
+            <w:pPr>
+              <w:pStyle w:val="Compact"/>
+            </w:pPr>
+            <w:r>
+              <w:t xml:space="preserve">Service not running</w:t>
+            </w:r>
+          </w:p>
+        </w:tc>
+        <w:tc>
+          <w:tcPr/>
+          <w:p>
+            <w:pPr>
+              <w:pStyle w:val="Compact"/>
+            </w:pPr>
+            <w:r>
+              <w:rPr>
+                <w:rStyle w:val="VerbatimChar"/>
+              </w:rPr>
+              <w:t xml:space="preserve">Get-Service CswAgent</w:t>
+            </w:r>
+            <w:r>
+              <w:t xml:space="preserve">; check Application event log</w:t>
+            </w:r>
+          </w:p>
+        </w:tc>
+      </w:tr>
+      <w:tr>
+        <w:tc>
+          <w:tcPr/>
+          <w:p>
+            <w:pPr>
+              <w:pStyle w:val="Compact"/>
+            </w:pPr>
+            <w:r>
+              <w:t xml:space="preserve">EDR block (1722 / 1603)</w:t>
+            </w:r>
+          </w:p>
+        </w:tc>
+        <w:tc>
+          <w:tcPr/>
+          <w:p>
+            <w:pPr>
+              <w:pStyle w:val="Compact"/>
+            </w:pPr>
+            <w:r>
+              <w:t xml:space="preserve">Add Defender exclusions before redeploy</w:t>
+            </w:r>
+          </w:p>
+        </w:tc>
+      </w:tr>
+      <w:tr>
+        <w:tc>
+          <w:tcPr/>
+          <w:p>
+            <w:pPr>
+              <w:pStyle w:val="Compact"/>
+            </w:pPr>
+            <w:r>
+              <w:t xml:space="preserve">Network</w:t>
+            </w:r>
+          </w:p>
+        </w:tc>
+        <w:tc>
+          <w:tcPr/>
+          <w:p>
+            <w:pPr>
+              <w:pStyle w:val="Compact"/>
+            </w:pPr>
+            <w:r>
+              <w:rPr>
+                <w:rStyle w:val="VerbatimChar"/>
+              </w:rPr>
+              <w:t xml:space="preserve">Test-NetConnection &lt;cluster&gt; -Port 443</w:t>
+            </w:r>
+            <w:r>
+              <w:t xml:space="preserve">; add</w:t>
+            </w:r>
+            <w:r>
+              <w:t xml:space="preserve"> </w:t>
+            </w:r>
+            <w:r>
+              <w:rPr>
+                <w:rStyle w:val="VerbatimChar"/>
+              </w:rPr>
               <w:t xml:space="preserve">HTTPS_PROXY</w:t>
             </w:r>
             <w:r>
@@ -1757,31 +2144,10 @@
               <w:t xml:space="preserve">user.cfg</w:t>
             </w:r>
             <w:r>
-              <w:t xml:space="preserve">; redeploy</w:t>
-            </w:r>
-          </w:p>
-        </w:tc>
-      </w:tr>
-      <w:tr>
-        <w:tc>
-          <w:tcPr/>
-          <w:p>
-            <w:pPr>
-              <w:pStyle w:val="Compact"/>
-            </w:pPr>
-            <w:r>
-              <w:t xml:space="preserve">MSI/script errors</w:t>
-            </w:r>
-          </w:p>
-        </w:tc>
-        <w:tc>
-          <w:tcPr/>
-          <w:p>
-            <w:pPr>
-              <w:pStyle w:val="Compact"/>
-            </w:pPr>
-            <w:r>
-              <w:t xml:space="preserve">Collect verbose log; check EDR block</w:t>
+              <w:t xml:space="preserve"> </w:t>
+            </w:r>
+            <w:r>
+              <w:t xml:space="preserve">if proxied</w:t>
             </w:r>
           </w:p>
         </w:tc>
@@ -1801,7 +2167,24 @@
       <w:r>
         <w:t xml:space="preserve"> </w:t>
       </w:r>
-      <w:hyperlink r:id="rId16">
+      <w:hyperlink r:id="rId18">
+        <w:r>
+          <w:rPr>
+            <w:rStyle w:val="VerbatimChar"/>
+          </w:rPr>
+          <w:t xml:space="preserve">tanium/README.md</w:t>
+        </w:r>
+      </w:hyperlink>
+      <w:r>
+        <w:t xml:space="preserve"> </w:t>
+      </w:r>
+      <w:r>
+        <w:t xml:space="preserve">·</w:t>
+      </w:r>
+      <w:r>
+        <w:t xml:space="preserve"> </w:t>
+      </w:r>
+      <w:hyperlink r:id="rId19">
         <w:r>
           <w:rPr>
             <w:rStyle w:val="VerbatimChar"/>
@@ -1829,7 +2212,8 @@
         <w:t xml:space="preserve">Draft v1 — cross-check against the Cisco Secure Workload User Guide for your release before production use.</w:t>
       </w:r>
     </w:p>
-    <w:bookmarkEnd w:id="17"/>
+    <w:bookmarkEnd w:id="20"/>
+    <w:bookmarkEnd w:id="21"/>
     <w:sectPr>
       <w:footnotePr>
         <w:numRestart w:val="eachSect"/>

</xml_diff>

<commit_message>
Clarify Linux and Windows are separate CSW downloads for Tanium.
Document per-OS download workflow, separate Tanium packages, and RPM vs DEB
split so customers do not combine installers across OS families.

Co-authored-by: Cursor <cursoragent@cursor.com>
</commit_message>
<xml_diff>
--- a/tanium/TANIUM-DEPLOYMENT-CHECKLIST.docx
+++ b/tanium/TANIUM-DEPLOYMENT-CHECKLIST.docx
@@ -76,13 +76,13 @@
         </w:r>
       </w:hyperlink>
     </w:p>
-    <w:bookmarkStart w:id="11" w:name="critical-rule"/>
+    <w:bookmarkStart w:id="11" w:name="critical-rules"/>
     <w:p>
       <w:pPr>
         <w:pStyle w:val="Heading2"/>
       </w:pPr>
       <w:r>
-        <w:t xml:space="preserve">Critical rule</w:t>
+        <w:t xml:space="preserve">Critical rules</w:t>
       </w:r>
     </w:p>
     <w:p>
@@ -94,7 +94,160 @@
           <w:b/>
           <w:bCs/>
         </w:rPr>
-        <w:t xml:space="preserve">Write</w:t>
+        <w:t xml:space="preserve">1. Linux and Windows are separate CSW downloads.</w:t>
+      </w:r>
+      <w:r>
+        <w:t xml:space="preserve"> </w:t>
+      </w:r>
+      <w:r>
+        <w:t xml:space="preserve">In</w:t>
+      </w:r>
+      <w:r>
+        <w:t xml:space="preserve"> </w:t>
+      </w:r>
+      <w:r>
+        <w:rPr>
+          <w:i/>
+          <w:iCs/>
+        </w:rPr>
+        <w:t xml:space="preserve">Manage → Agents → Install</w:t>
+      </w:r>
+      <w:r>
+        <w:rPr>
+          <w:i/>
+          <w:iCs/>
+        </w:rPr>
+        <w:t xml:space="preserve"> </w:t>
+      </w:r>
+      <w:r>
+        <w:rPr>
+          <w:i/>
+          <w:iCs/>
+        </w:rPr>
+        <w:t xml:space="preserve">Agent</w:t>
+      </w:r>
+      <w:r>
+        <w:t xml:space="preserve">, choose</w:t>
+      </w:r>
+      <w:r>
+        <w:t xml:space="preserve"> </w:t>
+      </w:r>
+      <w:r>
+        <w:rPr>
+          <w:b/>
+          <w:bCs/>
+        </w:rPr>
+        <w:t xml:space="preserve">OS = Linux</w:t>
+      </w:r>
+      <w:r>
+        <w:t xml:space="preserve"> </w:t>
+      </w:r>
+      <w:r>
+        <w:t xml:space="preserve">and download (</w:t>
+      </w:r>
+      <w:r>
+        <w:rPr>
+          <w:rStyle w:val="VerbatimChar"/>
+        </w:rPr>
+        <w:t xml:space="preserve">.rpm</w:t>
+      </w:r>
+      <w:r>
+        <w:t xml:space="preserve">/</w:t>
+      </w:r>
+      <w:r>
+        <w:rPr>
+          <w:rStyle w:val="VerbatimChar"/>
+        </w:rPr>
+        <w:t xml:space="preserve">.deb</w:t>
+      </w:r>
+      <w:r>
+        <w:t xml:space="preserve">/</w:t>
+      </w:r>
+      <w:r>
+        <w:rPr>
+          <w:rStyle w:val="VerbatimChar"/>
+        </w:rPr>
+        <w:t xml:space="preserve">.sh</w:t>
+      </w:r>
+      <w:r>
+        <w:t xml:space="preserve"> </w:t>
+      </w:r>
+      <w:r>
+        <w:t xml:space="preserve">+ site files),</w:t>
+      </w:r>
+      <w:r>
+        <w:t xml:space="preserve"> </w:t>
+      </w:r>
+      <w:r>
+        <w:t xml:space="preserve">then run the wizard again with</w:t>
+      </w:r>
+      <w:r>
+        <w:t xml:space="preserve"> </w:t>
+      </w:r>
+      <w:r>
+        <w:rPr>
+          <w:b/>
+          <w:bCs/>
+        </w:rPr>
+        <w:t xml:space="preserve">OS = Windows</w:t>
+      </w:r>
+      <w:r>
+        <w:t xml:space="preserve"> </w:t>
+      </w:r>
+      <w:r>
+        <w:t xml:space="preserve">and download (</w:t>
+      </w:r>
+      <w:r>
+        <w:rPr>
+          <w:rStyle w:val="VerbatimChar"/>
+        </w:rPr>
+        <w:t xml:space="preserve">.msi</w:t>
+      </w:r>
+      <w:r>
+        <w:t xml:space="preserve"> </w:t>
+      </w:r>
+      <w:r>
+        <w:t xml:space="preserve">ZIP + site</w:t>
+      </w:r>
+      <w:r>
+        <w:t xml:space="preserve"> </w:t>
+      </w:r>
+      <w:r>
+        <w:t xml:space="preserve">files). Build</w:t>
+      </w:r>
+      <w:r>
+        <w:t xml:space="preserve"> </w:t>
+      </w:r>
+      <w:r>
+        <w:rPr>
+          <w:b/>
+          <w:bCs/>
+        </w:rPr>
+        <w:t xml:space="preserve">separate Tanium packages</w:t>
+      </w:r>
+      <w:r>
+        <w:t xml:space="preserve"> </w:t>
+      </w:r>
+      <w:r>
+        <w:t xml:space="preserve">— do not put Windows and Linux</w:t>
+      </w:r>
+      <w:r>
+        <w:t xml:space="preserve"> </w:t>
+      </w:r>
+      <w:r>
+        <w:t xml:space="preserve">installers in one package.</w:t>
+      </w:r>
+    </w:p>
+    <w:p>
+      <w:pPr>
+        <w:pStyle w:val="BodyText"/>
+      </w:pPr>
+      <w:r>
+        <w:rPr>
+          <w:b/>
+          <w:bCs/>
+        </w:rPr>
+        <w:t xml:space="preserve">2. Pre-stage</w:t>
       </w:r>
       <w:r>
         <w:rPr>
@@ -123,43 +276,41 @@
           <w:b/>
           <w:bCs/>
         </w:rPr>
-        <w:t xml:space="preserve">with the activation key in the install directory</w:t>
+        <w:t xml:space="preserve">before install.</w:t>
+      </w:r>
+      <w:r>
+        <w:t xml:space="preserve"> </w:t>
+      </w:r>
+      <w:r>
+        <w:t xml:space="preserve">Write the activation key in the</w:t>
+      </w:r>
+      <w:r>
+        <w:t xml:space="preserve"> </w:t>
+      </w:r>
+      <w:r>
+        <w:t xml:space="preserve">install directory</w:t>
+      </w:r>
+      <w:r>
+        <w:t xml:space="preserve"> </w:t>
       </w:r>
       <w:r>
         <w:rPr>
-          <w:b/>
-          <w:bCs/>
-        </w:rPr>
-        <w:t xml:space="preserve"> </w:t>
-      </w:r>
-      <w:r>
-        <w:rPr>
-          <w:b/>
-          <w:bCs/>
           <w:i/>
           <w:iCs/>
         </w:rPr>
         <w:t xml:space="preserve">before</w:t>
       </w:r>
       <w:r>
-        <w:rPr>
-          <w:b/>
-          <w:bCs/>
-        </w:rPr>
         <w:t xml:space="preserve"> </w:t>
       </w:r>
       <w:r>
-        <w:rPr>
-          <w:b/>
-          <w:bCs/>
-        </w:rPr>
-        <w:t xml:space="preserve">Tanium runs any install command.</w:t>
+        <w:t xml:space="preserve">Tanium runs any install command. Without it, the</w:t>
       </w:r>
       <w:r>
         <w:t xml:space="preserve"> </w:t>
       </w:r>
       <w:r>
-        <w:t xml:space="preserve">Without it, the agent may install but stay</w:t>
+        <w:t xml:space="preserve">agent may install but stay</w:t>
       </w:r>
       <w:r>
         <w:t xml:space="preserve"> </w:t>
@@ -253,6 +404,36 @@
       </w:pPr>
       <w:r>
         <w:t xml:space="preserve">Pre-flight (CSW admin)</w:t>
+      </w:r>
+    </w:p>
+    <w:p>
+      <w:pPr>
+        <w:pStyle w:val="FirstParagraph"/>
+      </w:pPr>
+      <w:r>
+        <w:t xml:space="preserve">Complete the block below</w:t>
+      </w:r>
+      <w:r>
+        <w:t xml:space="preserve"> </w:t>
+      </w:r>
+      <w:r>
+        <w:rPr>
+          <w:b/>
+          <w:bCs/>
+        </w:rPr>
+        <w:t xml:space="preserve">once per OS</w:t>
+      </w:r>
+      <w:r>
+        <w:t xml:space="preserve"> </w:t>
+      </w:r>
+      <w:r>
+        <w:t xml:space="preserve">(Linux download, then Windows download</w:t>
+      </w:r>
+      <w:r>
+        <w:t xml:space="preserve"> </w:t>
+      </w:r>
+      <w:r>
+        <w:t xml:space="preserve">if both are in scope).</w:t>
       </w:r>
     </w:p>
     <w:tbl>
@@ -381,20 +562,17 @@
               <w:pStyle w:val="Compact"/>
             </w:pPr>
             <w:r>
-              <w:t xml:space="preserve">Open</w:t>
-            </w:r>
-            <w:r>
-              <w:t xml:space="preserve"> </w:t>
-            </w:r>
-            <w:r>
               <w:rPr>
                 <w:b/>
                 <w:bCs/>
               </w:rPr>
-              <w:t xml:space="preserve">Manage → Agents → Install Agent</w:t>
-            </w:r>
-            <w:r>
-              <w:t xml:space="preserve">; copy</w:t>
+              <w:t xml:space="preserve">Linux:</w:t>
+            </w:r>
+            <w:r>
+              <w:t xml:space="preserve"> </w:t>
+            </w:r>
+            <w:r>
+              <w:t xml:space="preserve">wizard → OS</w:t>
             </w:r>
             <w:r>
               <w:t xml:space="preserve"> </w:t>
@@ -404,38 +582,13 @@
                 <w:b/>
                 <w:bCs/>
               </w:rPr>
-              <w:t xml:space="preserve">activation key</w:t>
-            </w:r>
-            <w:r>
-              <w:t xml:space="preserve"> </w:t>
-            </w:r>
-            <w:r>
-              <w:t xml:space="preserve">(treat as secret)</w:t>
-            </w:r>
-          </w:p>
-        </w:tc>
-        <w:tc>
-          <w:tcPr/>
-          <w:p>
-            <w:pPr>
-              <w:pStyle w:val="Compact"/>
-              <w:jc w:val="center"/>
-            </w:pPr>
-            <w:r>
-              <w:t xml:space="preserve">☐</w:t>
-            </w:r>
-          </w:p>
-        </w:tc>
-      </w:tr>
-      <w:tr>
-        <w:tc>
-          <w:tcPr/>
-          <w:p>
-            <w:pPr>
-              <w:pStyle w:val="Compact"/>
-            </w:pPr>
-            <w:r>
-              <w:t xml:space="preserve">Download installer bundle or script for the</w:t>
+              <w:t xml:space="preserve">Linux</w:t>
+            </w:r>
+            <w:r>
+              <w:t xml:space="preserve"> </w:t>
+            </w:r>
+            <w:r>
+              <w:t xml:space="preserve">→ pick</w:t>
             </w:r>
             <w:r>
               <w:t xml:space="preserve"> </w:t>
@@ -445,38 +598,13 @@
                 <w:b/>
                 <w:bCs/>
               </w:rPr>
-              <w:t xml:space="preserve">same</w:t>
-            </w:r>
-            <w:r>
-              <w:t xml:space="preserve"> </w:t>
-            </w:r>
-            <w:r>
-              <w:t xml:space="preserve">choices</w:t>
-            </w:r>
-          </w:p>
-        </w:tc>
-        <w:tc>
-          <w:tcPr/>
-          <w:p>
-            <w:pPr>
-              <w:pStyle w:val="Compact"/>
-              <w:jc w:val="center"/>
-            </w:pPr>
-            <w:r>
-              <w:t xml:space="preserve">☐</w:t>
-            </w:r>
-          </w:p>
-        </w:tc>
-      </w:tr>
-      <w:tr>
-        <w:tc>
-          <w:tcPr/>
-          <w:p>
-            <w:pPr>
-              <w:pStyle w:val="Compact"/>
-            </w:pPr>
-            <w:r>
-              <w:t xml:space="preserve">Confirm outbound</w:t>
+              <w:t xml:space="preserve">distro/version</w:t>
+            </w:r>
+            <w:r>
+              <w:t xml:space="preserve"> </w:t>
+            </w:r>
+            <w:r>
+              <w:t xml:space="preserve">→ copy</w:t>
             </w:r>
             <w:r>
               <w:t xml:space="preserve"> </w:t>
@@ -486,38 +614,13 @@
                 <w:b/>
                 <w:bCs/>
               </w:rPr>
-              <w:t xml:space="preserve">443/TCP</w:t>
-            </w:r>
-            <w:r>
-              <w:t xml:space="preserve"> </w:t>
-            </w:r>
-            <w:r>
-              <w:t xml:space="preserve">(and on-prem collector/enforcer ports if applicable)</w:t>
-            </w:r>
-          </w:p>
-        </w:tc>
-        <w:tc>
-          <w:tcPr/>
-          <w:p>
-            <w:pPr>
-              <w:pStyle w:val="Compact"/>
-              <w:jc w:val="center"/>
-            </w:pPr>
-            <w:r>
-              <w:t xml:space="preserve">☐</w:t>
-            </w:r>
-          </w:p>
-        </w:tc>
-      </w:tr>
-      <w:tr>
-        <w:tc>
-          <w:tcPr/>
-          <w:p>
-            <w:pPr>
-              <w:pStyle w:val="Compact"/>
-            </w:pPr>
-            <w:r>
-              <w:t xml:space="preserve">Configure</w:t>
+              <w:t xml:space="preserve">activation key</w:t>
+            </w:r>
+            <w:r>
+              <w:t xml:space="preserve"> </w:t>
+            </w:r>
+            <w:r>
+              <w:t xml:space="preserve">→</w:t>
             </w:r>
             <w:r>
               <w:t xml:space="preserve"> </w:t>
@@ -527,13 +630,55 @@
                 <w:b/>
                 <w:bCs/>
               </w:rPr>
-              <w:t xml:space="preserve">EDR/AV exclusions</w:t>
-            </w:r>
-            <w:r>
-              <w:t xml:space="preserve"> </w:t>
-            </w:r>
-            <w:r>
-              <w:t xml:space="preserve">on endpoints before deploy</w:t>
+              <w:t xml:space="preserve">Download</w:t>
+            </w:r>
+            <w:r>
+              <w:t xml:space="preserve"> </w:t>
+            </w:r>
+            <w:r>
+              <w:t xml:space="preserve">(</w:t>
+            </w:r>
+            <w:r>
+              <w:rPr>
+                <w:rStyle w:val="VerbatimChar"/>
+              </w:rPr>
+              <w:t xml:space="preserve">.rpm</w:t>
+            </w:r>
+            <w:r>
+              <w:t xml:space="preserve"> </w:t>
+            </w:r>
+            <w:r>
+              <w:t xml:space="preserve">or</w:t>
+            </w:r>
+            <w:r>
+              <w:t xml:space="preserve"> </w:t>
+            </w:r>
+            <w:r>
+              <w:rPr>
+                <w:rStyle w:val="VerbatimChar"/>
+              </w:rPr>
+              <w:t xml:space="preserve">.deb</w:t>
+            </w:r>
+            <w:r>
+              <w:t xml:space="preserve"> </w:t>
+            </w:r>
+            <w:r>
+              <w:t xml:space="preserve">or</w:t>
+            </w:r>
+            <w:r>
+              <w:t xml:space="preserve"> </w:t>
+            </w:r>
+            <w:r>
+              <w:rPr>
+                <w:rStyle w:val="VerbatimChar"/>
+              </w:rPr>
+              <w:t xml:space="preserve">.sh</w:t>
+            </w:r>
+            <w:r>
+              <w:t xml:space="preserve"> </w:t>
+            </w:r>
+            <w:r>
+              <w:t xml:space="preserve">+ site files)</w:t>
             </w:r>
           </w:p>
         </w:tc>
@@ -557,24 +702,230 @@
             <w:pPr>
               <w:pStyle w:val="Compact"/>
             </w:pPr>
-            <w:r>
-              <w:t xml:space="preserve">Store activation key in</w:t>
-            </w:r>
-            <w:r>
-              <w:t xml:space="preserve"> </w:t>
-            </w:r>
             <w:r>
               <w:rPr>
                 <w:b/>
                 <w:bCs/>
               </w:rPr>
-              <w:t xml:space="preserve">Tanium package variable</w:t>
-            </w:r>
-            <w:r>
-              <w:t xml:space="preserve"> </w:t>
-            </w:r>
-            <w:r>
-              <w:t xml:space="preserve">(not plain-text Git)</w:t>
+              <w:t xml:space="preserve">Windows:</w:t>
+            </w:r>
+            <w:r>
+              <w:t xml:space="preserve"> </w:t>
+            </w:r>
+            <w:r>
+              <w:t xml:space="preserve">new wizard run → OS</w:t>
+            </w:r>
+            <w:r>
+              <w:t xml:space="preserve"> </w:t>
+            </w:r>
+            <w:r>
+              <w:rPr>
+                <w:b/>
+                <w:bCs/>
+              </w:rPr>
+              <w:t xml:space="preserve">Windows</w:t>
+            </w:r>
+            <w:r>
+              <w:t xml:space="preserve"> </w:t>
+            </w:r>
+            <w:r>
+              <w:t xml:space="preserve">→ copy</w:t>
+            </w:r>
+            <w:r>
+              <w:t xml:space="preserve"> </w:t>
+            </w:r>
+            <w:r>
+              <w:rPr>
+                <w:b/>
+                <w:bCs/>
+              </w:rPr>
+              <w:t xml:space="preserve">activation key</w:t>
+            </w:r>
+            <w:r>
+              <w:t xml:space="preserve"> </w:t>
+            </w:r>
+            <w:r>
+              <w:t xml:space="preserve">→</w:t>
+            </w:r>
+            <w:r>
+              <w:t xml:space="preserve"> </w:t>
+            </w:r>
+            <w:r>
+              <w:rPr>
+                <w:b/>
+                <w:bCs/>
+              </w:rPr>
+              <w:t xml:space="preserve">Download</w:t>
+            </w:r>
+            <w:r>
+              <w:t xml:space="preserve"> </w:t>
+            </w:r>
+            <w:r>
+              <w:t xml:space="preserve">(MSI ZIP + site files)</w:t>
+            </w:r>
+          </w:p>
+        </w:tc>
+        <w:tc>
+          <w:tcPr/>
+          <w:p>
+            <w:pPr>
+              <w:pStyle w:val="Compact"/>
+              <w:jc w:val="center"/>
+            </w:pPr>
+            <w:r>
+              <w:t xml:space="preserve">☐</w:t>
+            </w:r>
+          </w:p>
+        </w:tc>
+      </w:tr>
+      <w:tr>
+        <w:tc>
+          <w:tcPr/>
+          <w:p>
+            <w:pPr>
+              <w:pStyle w:val="Compact"/>
+            </w:pPr>
+            <w:r>
+              <w:t xml:space="preserve">Confirm outbound</w:t>
+            </w:r>
+            <w:r>
+              <w:t xml:space="preserve"> </w:t>
+            </w:r>
+            <w:r>
+              <w:rPr>
+                <w:b/>
+                <w:bCs/>
+              </w:rPr>
+              <w:t xml:space="preserve">443/TCP</w:t>
+            </w:r>
+            <w:r>
+              <w:t xml:space="preserve"> </w:t>
+            </w:r>
+            <w:r>
+              <w:t xml:space="preserve">(and on-prem collector/enforcer ports if applicable)</w:t>
+            </w:r>
+          </w:p>
+        </w:tc>
+        <w:tc>
+          <w:tcPr/>
+          <w:p>
+            <w:pPr>
+              <w:pStyle w:val="Compact"/>
+              <w:jc w:val="center"/>
+            </w:pPr>
+            <w:r>
+              <w:t xml:space="preserve">☐</w:t>
+            </w:r>
+          </w:p>
+        </w:tc>
+      </w:tr>
+      <w:tr>
+        <w:tc>
+          <w:tcPr/>
+          <w:p>
+            <w:pPr>
+              <w:pStyle w:val="Compact"/>
+            </w:pPr>
+            <w:r>
+              <w:t xml:space="preserve">Configure</w:t>
+            </w:r>
+            <w:r>
+              <w:t xml:space="preserve"> </w:t>
+            </w:r>
+            <w:r>
+              <w:rPr>
+                <w:b/>
+                <w:bCs/>
+              </w:rPr>
+              <w:t xml:space="preserve">EDR/AV exclusions</w:t>
+            </w:r>
+            <w:r>
+              <w:t xml:space="preserve"> </w:t>
+            </w:r>
+            <w:r>
+              <w:t xml:space="preserve">on endpoints before deploy</w:t>
+            </w:r>
+          </w:p>
+        </w:tc>
+        <w:tc>
+          <w:tcPr/>
+          <w:p>
+            <w:pPr>
+              <w:pStyle w:val="Compact"/>
+              <w:jc w:val="center"/>
+            </w:pPr>
+            <w:r>
+              <w:t xml:space="preserve">☐</w:t>
+            </w:r>
+          </w:p>
+        </w:tc>
+      </w:tr>
+      <w:tr>
+        <w:tc>
+          <w:tcPr/>
+          <w:p>
+            <w:pPr>
+              <w:pStyle w:val="Compact"/>
+            </w:pPr>
+            <w:r>
+              <w:t xml:space="preserve">Create</w:t>
+            </w:r>
+            <w:r>
+              <w:t xml:space="preserve"> </w:t>
+            </w:r>
+            <w:r>
+              <w:rPr>
+                <w:b/>
+                <w:bCs/>
+              </w:rPr>
+              <w:t xml:space="preserve">separate Tanium packages</w:t>
+            </w:r>
+            <w:r>
+              <w:t xml:space="preserve"> </w:t>
+            </w:r>
+            <w:r>
+              <w:t xml:space="preserve">(Linux vs Windows; split RPM vs DEB if needed)</w:t>
+            </w:r>
+          </w:p>
+        </w:tc>
+        <w:tc>
+          <w:tcPr/>
+          <w:p>
+            <w:pPr>
+              <w:pStyle w:val="Compact"/>
+              <w:jc w:val="center"/>
+            </w:pPr>
+            <w:r>
+              <w:t xml:space="preserve">☐</w:t>
+            </w:r>
+          </w:p>
+        </w:tc>
+      </w:tr>
+      <w:tr>
+        <w:tc>
+          <w:tcPr/>
+          <w:p>
+            <w:pPr>
+              <w:pStyle w:val="Compact"/>
+            </w:pPr>
+            <w:r>
+              <w:t xml:space="preserve">Store each OS's activation key in</w:t>
+            </w:r>
+            <w:r>
+              <w:t xml:space="preserve"> </w:t>
+            </w:r>
+            <w:r>
+              <w:rPr>
+                <w:b/>
+                <w:bCs/>
+              </w:rPr>
+              <w:t xml:space="preserve">that package's</w:t>
+            </w:r>
+            <w:r>
+              <w:t xml:space="preserve"> </w:t>
+            </w:r>
+            <w:r>
+              <w:t xml:space="preserve">Tanium variable (not plain-text Git)</w:t>
             </w:r>
           </w:p>
         </w:tc>
@@ -600,373 +951,13 @@
       </w:r>
     </w:p>
     <w:bookmarkEnd w:id="12"/>
-    <w:bookmarkStart w:id="13" w:name="X12bf89a474ee2a4c4bbe60fb4ee16d1cabb2878"/>
+    <w:bookmarkStart w:id="13" w:name="tanium-packages-one-per-csw-download"/>
     <w:p>
       <w:pPr>
         <w:pStyle w:val="Heading2"/>
       </w:pPr>
       <w:r>
-        <w:t xml:space="preserve">Package contents (same folder on every endpoint)</w:t>
-      </w:r>
-    </w:p>
-    <w:tbl>
-      <w:tblPr>
-        <w:tblStyle w:val="Table"/>
-        <w:tblW w:type="auto" w:w="0"/>
-        <w:tblLook w:firstRow="1" w:lastRow="0" w:firstColumn="0" w:lastColumn="0" w:noHBand="0" w:noVBand="0" w:val="0020"/>
-      </w:tblPr>
-      <w:tblGrid>
-        <w:gridCol w:w="3960"/>
-        <w:gridCol w:w="3960"/>
-      </w:tblGrid>
-      <w:tr>
-        <w:trPr>
-          <w:tblHeader w:val="on"/>
-        </w:trPr>
-        <w:tc>
-          <w:tcPr/>
-          <w:p>
-            <w:pPr>
-              <w:pStyle w:val="Compact"/>
-            </w:pPr>
-            <w:r>
-              <w:t xml:space="preserve">File</w:t>
-            </w:r>
-          </w:p>
-        </w:tc>
-        <w:tc>
-          <w:tcPr/>
-          <w:p>
-            <w:pPr>
-              <w:pStyle w:val="Compact"/>
-              <w:jc w:val="center"/>
-            </w:pPr>
-            <w:r>
-              <w:t xml:space="preserve">Required</w:t>
-            </w:r>
-          </w:p>
-        </w:tc>
-      </w:tr>
-      <w:tr>
-        <w:tc>
-          <w:tcPr/>
-          <w:p>
-            <w:pPr>
-              <w:pStyle w:val="Compact"/>
-            </w:pPr>
-            <w:r>
-              <w:rPr>
-                <w:rStyle w:val="VerbatimChar"/>
-                <w:b/>
-                <w:bCs/>
-              </w:rPr>
-              <w:t xml:space="preserve">user.cfg</w:t>
-            </w:r>
-            <w:r>
-              <w:t xml:space="preserve"> </w:t>
-            </w:r>
-            <w:r>
-              <w:t xml:space="preserve">(with</w:t>
-            </w:r>
-            <w:r>
-              <w:t xml:space="preserve"> </w:t>
-            </w:r>
-            <w:r>
-              <w:rPr>
-                <w:rStyle w:val="VerbatimChar"/>
-              </w:rPr>
-              <w:t xml:space="preserve">ACTIVATION_KEY</w:t>
-            </w:r>
-            <w:r>
-              <w:t xml:space="preserve"> </w:t>
-            </w:r>
-            <w:r>
-              <w:t xml:space="preserve">pre-staged)</w:t>
-            </w:r>
-          </w:p>
-        </w:tc>
-        <w:tc>
-          <w:tcPr/>
-          <w:p>
-            <w:pPr>
-              <w:pStyle w:val="Compact"/>
-              <w:jc w:val="center"/>
-            </w:pPr>
-            <w:r>
-              <w:rPr>
-                <w:b/>
-                <w:bCs/>
-              </w:rPr>
-              <w:t xml:space="preserve">Yes</w:t>
-            </w:r>
-          </w:p>
-        </w:tc>
-      </w:tr>
-      <w:tr>
-        <w:tc>
-          <w:tcPr/>
-          <w:p>
-            <w:pPr>
-              <w:pStyle w:val="Compact"/>
-            </w:pPr>
-            <w:r>
-              <w:rPr>
-                <w:rStyle w:val="VerbatimChar"/>
-              </w:rPr>
-              <w:t xml:space="preserve">ca.cert</w:t>
-            </w:r>
-          </w:p>
-        </w:tc>
-        <w:tc>
-          <w:tcPr/>
-          <w:p>
-            <w:pPr>
-              <w:pStyle w:val="Compact"/>
-              <w:jc w:val="center"/>
-            </w:pPr>
-            <w:r>
-              <w:t xml:space="preserve">Yes</w:t>
-            </w:r>
-          </w:p>
-        </w:tc>
-      </w:tr>
-      <w:tr>
-        <w:tc>
-          <w:tcPr/>
-          <w:p>
-            <w:pPr>
-              <w:pStyle w:val="Compact"/>
-            </w:pPr>
-            <w:r>
-              <w:rPr>
-                <w:rStyle w:val="VerbatimChar"/>
-              </w:rPr>
-              <w:t xml:space="preserve">site.cfg</w:t>
-            </w:r>
-          </w:p>
-        </w:tc>
-        <w:tc>
-          <w:tcPr/>
-          <w:p>
-            <w:pPr>
-              <w:pStyle w:val="Compact"/>
-              <w:jc w:val="center"/>
-            </w:pPr>
-            <w:r>
-              <w:t xml:space="preserve">Yes</w:t>
-            </w:r>
-          </w:p>
-        </w:tc>
-      </w:tr>
-      <w:tr>
-        <w:tc>
-          <w:tcPr/>
-          <w:p>
-            <w:pPr>
-              <w:pStyle w:val="Compact"/>
-            </w:pPr>
-            <w:r>
-              <w:rPr>
-                <w:rStyle w:val="VerbatimChar"/>
-              </w:rPr>
-              <w:t xml:space="preserve">sensor_config</w:t>
-            </w:r>
-          </w:p>
-        </w:tc>
-        <w:tc>
-          <w:tcPr/>
-          <w:p>
-            <w:pPr>
-              <w:pStyle w:val="Compact"/>
-              <w:jc w:val="center"/>
-            </w:pPr>
-            <w:r>
-              <w:t xml:space="preserve">Yes</w:t>
-            </w:r>
-          </w:p>
-        </w:tc>
-      </w:tr>
-      <w:tr>
-        <w:tc>
-          <w:tcPr/>
-          <w:p>
-            <w:pPr>
-              <w:pStyle w:val="Compact"/>
-            </w:pPr>
-            <w:r>
-              <w:rPr>
-                <w:rStyle w:val="VerbatimChar"/>
-              </w:rPr>
-              <w:t xml:space="preserve">sensor_type</w:t>
-            </w:r>
-          </w:p>
-        </w:tc>
-        <w:tc>
-          <w:tcPr/>
-          <w:p>
-            <w:pPr>
-              <w:pStyle w:val="Compact"/>
-              <w:jc w:val="center"/>
-            </w:pPr>
-            <w:r>
-              <w:t xml:space="preserve">Yes</w:t>
-            </w:r>
-          </w:p>
-        </w:tc>
-      </w:tr>
-      <w:tr>
-        <w:tc>
-          <w:tcPr/>
-          <w:p>
-            <w:pPr>
-              <w:pStyle w:val="Compact"/>
-            </w:pPr>
-            <w:r>
-              <w:rPr>
-                <w:rStyle w:val="VerbatimChar"/>
-              </w:rPr>
-              <w:t xml:space="preserve">enforcer.cfg</w:t>
-            </w:r>
-          </w:p>
-        </w:tc>
-        <w:tc>
-          <w:tcPr/>
-          <w:p>
-            <w:pPr>
-              <w:pStyle w:val="Compact"/>
-              <w:jc w:val="center"/>
-            </w:pPr>
-            <w:r>
-              <w:t xml:space="preserve">If enforcement</w:t>
-            </w:r>
-          </w:p>
-        </w:tc>
-      </w:tr>
-      <w:tr>
-        <w:tc>
-          <w:tcPr/>
-          <w:p>
-            <w:pPr>
-              <w:pStyle w:val="Compact"/>
-            </w:pPr>
-            <w:r>
-              <w:rPr>
-                <w:rStyle w:val="VerbatimChar"/>
-              </w:rPr>
-              <w:t xml:space="preserve">TetrationAgentInstaller.msi</w:t>
-            </w:r>
-            <w:r>
-              <w:t xml:space="preserve"> </w:t>
-            </w:r>
-            <w:r>
-              <w:t xml:space="preserve">(Windows) or</w:t>
-            </w:r>
-            <w:r>
-              <w:t xml:space="preserve"> </w:t>
-            </w:r>
-            <w:r>
-              <w:rPr>
-                <w:rStyle w:val="VerbatimChar"/>
-              </w:rPr>
-              <w:t xml:space="preserve">.rpm</w:t>
-            </w:r>
-            <w:r>
-              <w:t xml:space="preserve">/</w:t>
-            </w:r>
-            <w:r>
-              <w:rPr>
-                <w:rStyle w:val="VerbatimChar"/>
-              </w:rPr>
-              <w:t xml:space="preserve">.deb</w:t>
-            </w:r>
-            <w:r>
-              <w:t xml:space="preserve">/</w:t>
-            </w:r>
-            <w:r>
-              <w:rPr>
-                <w:rStyle w:val="VerbatimChar"/>
-              </w:rPr>
-              <w:t xml:space="preserve">.sh</w:t>
-            </w:r>
-            <w:r>
-              <w:t xml:space="preserve"> </w:t>
-            </w:r>
-            <w:r>
-              <w:t xml:space="preserve">(Linux)</w:t>
-            </w:r>
-          </w:p>
-        </w:tc>
-        <w:tc>
-          <w:tcPr/>
-          <w:p>
-            <w:pPr>
-              <w:pStyle w:val="Compact"/>
-              <w:jc w:val="center"/>
-            </w:pPr>
-            <w:r>
-              <w:t xml:space="preserve">Yes</w:t>
-            </w:r>
-          </w:p>
-        </w:tc>
-      </w:tr>
-    </w:tbl>
-    <w:p>
-      <w:pPr>
-        <w:pStyle w:val="BodyText"/>
-      </w:pPr>
-      <w:r>
-        <w:rPr>
-          <w:b/>
-          <w:bCs/>
-        </w:rPr>
-        <w:t xml:space="preserve">Suggested paths:</w:t>
-      </w:r>
-      <w:r>
-        <w:t xml:space="preserve"> </w:t>
-      </w:r>
-      <w:r>
-        <w:t xml:space="preserve">Linux</w:t>
-      </w:r>
-      <w:r>
-        <w:t xml:space="preserve"> </w:t>
-      </w:r>
-      <w:r>
-        <w:rPr>
-          <w:rStyle w:val="VerbatimChar"/>
-        </w:rPr>
-        <w:t xml:space="preserve">/opt/tanium/csw/</w:t>
-      </w:r>
-      <w:r>
-        <w:t xml:space="preserve"> </w:t>
-      </w:r>
-      <w:r>
-        <w:t xml:space="preserve">· Windows</w:t>
-      </w:r>
-      <w:r>
-        <w:t xml:space="preserve"> </w:t>
-      </w:r>
-      <w:r>
-        <w:rPr>
-          <w:rStyle w:val="VerbatimChar"/>
-        </w:rPr>
-        <w:t xml:space="preserve">C:\Program Files\Tanium\csw\</w:t>
-      </w:r>
-    </w:p>
-    <w:p>
-      <w:r>
-        <w:pict>
-          <v:rect style="width:0;height:1.5pt" o:hralign="center" o:hrstd="t" o:hr="t"/>
-        </w:pict>
-      </w:r>
-    </w:p>
-    <w:bookmarkEnd w:id="13"/>
-    <w:bookmarkStart w:id="14" w:name="X90a02fb555be32b0e25dbfe708ee91edbaad061"/>
-    <w:p>
-      <w:pPr>
-        <w:pStyle w:val="Heading2"/>
-      </w:pPr>
-      <w:r>
-        <w:t xml:space="preserve">Tanium Deploy package steps (order matters)</w:t>
+        <w:t xml:space="preserve">Tanium packages (one per CSW download)</w:t>
       </w:r>
     </w:p>
     <w:tbl>
@@ -991,371 +982,134 @@
               <w:pStyle w:val="Compact"/>
             </w:pPr>
             <w:r>
-              <w:t xml:space="preserve">#</w:t>
-            </w:r>
-          </w:p>
-        </w:tc>
-        <w:tc>
-          <w:tcPr/>
-          <w:p>
-            <w:pPr>
-              <w:pStyle w:val="Compact"/>
-            </w:pPr>
-            <w:r>
-              <w:t xml:space="preserve">Package step</w:t>
-            </w:r>
-          </w:p>
-        </w:tc>
-        <w:tc>
-          <w:tcPr/>
-          <w:p>
-            <w:pPr>
-              <w:pStyle w:val="Compact"/>
-              <w:jc w:val="center"/>
-            </w:pPr>
-            <w:r>
-              <w:t xml:space="preserve">Done</w:t>
-            </w:r>
-          </w:p>
-        </w:tc>
-      </w:tr>
-      <w:tr>
-        <w:tc>
-          <w:tcPr/>
-          <w:p>
-            <w:pPr>
-              <w:pStyle w:val="Compact"/>
-            </w:pPr>
-            <w:r>
-              <w:t xml:space="preserve">1</w:t>
-            </w:r>
-          </w:p>
-        </w:tc>
-        <w:tc>
-          <w:tcPr/>
-          <w:p>
-            <w:pPr>
-              <w:pStyle w:val="Compact"/>
-            </w:pPr>
-            <w:r>
-              <w:rPr>
-                <w:b/>
-                <w:bCs/>
-              </w:rPr>
-              <w:t xml:space="preserve">Stage</w:t>
-            </w:r>
-            <w:r>
-              <w:rPr>
-                <w:b/>
-                <w:bCs/>
-              </w:rPr>
-              <w:t xml:space="preserve"> </w:t>
-            </w:r>
-            <w:r>
-              <w:rPr>
-                <w:rStyle w:val="VerbatimChar"/>
-                <w:b/>
-                <w:bCs/>
-              </w:rPr>
-              <w:t xml:space="preserve">user.cfg</w:t>
-            </w:r>
-            <w:r>
-              <w:t xml:space="preserve"> </w:t>
-            </w:r>
-            <w:r>
-              <w:t xml:space="preserve">— run</w:t>
-            </w:r>
-            <w:r>
-              <w:t xml:space="preserve"> </w:t>
-            </w:r>
-            <w:r>
-              <w:rPr>
-                <w:rStyle w:val="VerbatimChar"/>
-              </w:rPr>
-              <w:t xml:space="preserve">stage-user-cfg</w:t>
-            </w:r>
-            <w:r>
-              <w:t xml:space="preserve"> </w:t>
-            </w:r>
-            <w:r>
-              <w:t xml:space="preserve">script with</w:t>
-            </w:r>
-            <w:r>
-              <w:t xml:space="preserve"> </w:t>
-            </w:r>
-            <w:r>
-              <w:rPr>
-                <w:rStyle w:val="VerbatimChar"/>
-              </w:rPr>
-              <w:t xml:space="preserve">CSW_ACTIVATION_KEY</w:t>
-            </w:r>
-            <w:r>
-              <w:t xml:space="preserve"> </w:t>
-            </w:r>
-            <w:r>
-              <w:t xml:space="preserve">from Tanium variable</w:t>
-            </w:r>
-          </w:p>
-        </w:tc>
-        <w:tc>
-          <w:tcPr/>
-          <w:p>
-            <w:pPr>
-              <w:pStyle w:val="Compact"/>
-              <w:jc w:val="center"/>
-            </w:pPr>
-            <w:r>
-              <w:t xml:space="preserve">☐</w:t>
-            </w:r>
-          </w:p>
-        </w:tc>
-      </w:tr>
-      <w:tr>
-        <w:tc>
-          <w:tcPr/>
-          <w:p>
-            <w:pPr>
-              <w:pStyle w:val="Compact"/>
-            </w:pPr>
-            <w:r>
-              <w:t xml:space="preserve">2</w:t>
-            </w:r>
-          </w:p>
-        </w:tc>
-        <w:tc>
-          <w:tcPr/>
-          <w:p>
-            <w:pPr>
-              <w:pStyle w:val="Compact"/>
-            </w:pPr>
-            <w:r>
-              <w:t xml:space="preserve">Deploy full Cisco bundle (site files + installer) to install directory</w:t>
-            </w:r>
-          </w:p>
-        </w:tc>
-        <w:tc>
-          <w:tcPr/>
-          <w:p>
-            <w:pPr>
-              <w:pStyle w:val="Compact"/>
-              <w:jc w:val="center"/>
-            </w:pPr>
-            <w:r>
-              <w:t xml:space="preserve">☐</w:t>
-            </w:r>
-          </w:p>
-        </w:tc>
-      </w:tr>
-      <w:tr>
-        <w:tc>
-          <w:tcPr/>
-          <w:p>
-            <w:pPr>
-              <w:pStyle w:val="Compact"/>
-            </w:pPr>
-            <w:r>
-              <w:t xml:space="preserve">3</w:t>
-            </w:r>
-          </w:p>
-        </w:tc>
-        <w:tc>
-          <w:tcPr/>
-          <w:p>
-            <w:pPr>
-              <w:pStyle w:val="Compact"/>
-            </w:pPr>
-            <w:r>
-              <w:rPr>
-                <w:b/>
-                <w:bCs/>
-              </w:rPr>
-              <w:t xml:space="preserve">Install</w:t>
-            </w:r>
-            <w:r>
-              <w:t xml:space="preserve"> </w:t>
-            </w:r>
-            <w:r>
-              <w:t xml:space="preserve">— Linux:</w:t>
-            </w:r>
-            <w:r>
-              <w:t xml:space="preserve"> </w:t>
-            </w:r>
-            <w:r>
-              <w:rPr>
-                <w:rStyle w:val="VerbatimChar"/>
-              </w:rPr>
-              <w:t xml:space="preserve">tanium-linux-install.sh</w:t>
-            </w:r>
-            <w:r>
-              <w:t xml:space="preserve"> </w:t>
-            </w:r>
-            <w:r>
-              <w:t xml:space="preserve">· Windows:</w:t>
-            </w:r>
-            <w:r>
-              <w:t xml:space="preserve"> </w:t>
-            </w:r>
-            <w:r>
-              <w:rPr>
-                <w:rStyle w:val="VerbatimChar"/>
-              </w:rPr>
-              <w:t xml:space="preserve">tanium-windows-install.ps1</w:t>
-            </w:r>
-          </w:p>
-        </w:tc>
-        <w:tc>
-          <w:tcPr/>
-          <w:p>
-            <w:pPr>
-              <w:pStyle w:val="Compact"/>
-              <w:jc w:val="center"/>
-            </w:pPr>
-            <w:r>
-              <w:t xml:space="preserve">☐</w:t>
-            </w:r>
-          </w:p>
-        </w:tc>
-      </w:tr>
-      <w:tr>
-        <w:tc>
-          <w:tcPr/>
-          <w:p>
-            <w:pPr>
-              <w:pStyle w:val="Compact"/>
-            </w:pPr>
-            <w:r>
-              <w:t xml:space="preserve">4</w:t>
-            </w:r>
-          </w:p>
-        </w:tc>
-        <w:tc>
-          <w:tcPr/>
-          <w:p>
-            <w:pPr>
-              <w:pStyle w:val="Compact"/>
-            </w:pPr>
-            <w:r>
-              <w:t xml:space="preserve">Success criteria: exit code</w:t>
-            </w:r>
-            <w:r>
-              <w:t xml:space="preserve"> </w:t>
-            </w:r>
-            <w:r>
-              <w:rPr>
-                <w:b/>
-                <w:bCs/>
-              </w:rPr>
-              <w:t xml:space="preserve">0</w:t>
-            </w:r>
-            <w:r>
-              <w:t xml:space="preserve"> </w:t>
-            </w:r>
-            <w:r>
-              <w:t xml:space="preserve">+ service</w:t>
-            </w:r>
-            <w:r>
-              <w:t xml:space="preserve"> </w:t>
-            </w:r>
-            <w:r>
-              <w:rPr>
-                <w:b/>
-                <w:bCs/>
-              </w:rPr>
-              <w:t xml:space="preserve">Running</w:t>
-            </w:r>
-            <w:r>
-              <w:t xml:space="preserve"> </w:t>
-            </w:r>
-            <w:r>
-              <w:t xml:space="preserve">(</w:t>
-            </w:r>
-            <w:r>
-              <w:rPr>
-                <w:rStyle w:val="VerbatimChar"/>
-              </w:rPr>
-              <w:t xml:space="preserve">csw-agent</w:t>
-            </w:r>
-            <w:r>
-              <w:t xml:space="preserve"> </w:t>
-            </w:r>
-            <w:r>
-              <w:t xml:space="preserve">/</w:t>
-            </w:r>
-            <w:r>
-              <w:t xml:space="preserve"> </w:t>
-            </w:r>
-            <w:r>
-              <w:rPr>
-                <w:rStyle w:val="VerbatimChar"/>
-              </w:rPr>
-              <w:t xml:space="preserve">CswAgent</w:t>
-            </w:r>
-            <w:r>
-              <w:t xml:space="preserve">)</w:t>
-            </w:r>
-          </w:p>
-        </w:tc>
-        <w:tc>
-          <w:tcPr/>
-          <w:p>
-            <w:pPr>
-              <w:pStyle w:val="Compact"/>
-              <w:jc w:val="center"/>
-            </w:pPr>
-            <w:r>
-              <w:t xml:space="preserve">☐</w:t>
-            </w:r>
-          </w:p>
-        </w:tc>
-      </w:tr>
-      <w:tr>
-        <w:tc>
-          <w:tcPr/>
-          <w:p>
-            <w:pPr>
-              <w:pStyle w:val="Compact"/>
-            </w:pPr>
-            <w:r>
-              <w:t xml:space="preserve">5</w:t>
-            </w:r>
-          </w:p>
-        </w:tc>
-        <w:tc>
-          <w:tcPr/>
-          <w:p>
-            <w:pPr>
-              <w:pStyle w:val="Compact"/>
-            </w:pPr>
-            <w:r>
-              <w:t xml:space="preserve">Pilot wave → production waves; confirm CSW UI shows host</w:t>
-            </w:r>
-            <w:r>
-              <w:t xml:space="preserve"> </w:t>
-            </w:r>
-            <w:r>
-              <w:rPr>
-                <w:b/>
-                <w:bCs/>
-              </w:rPr>
-              <w:t xml:space="preserve">Running</w:t>
-            </w:r>
-            <w:r>
-              <w:t xml:space="preserve"> </w:t>
-            </w:r>
-            <w:r>
-              <w:t xml:space="preserve">within 1–2 min</w:t>
-            </w:r>
-          </w:p>
-        </w:tc>
-        <w:tc>
-          <w:tcPr/>
-          <w:p>
-            <w:pPr>
-              <w:pStyle w:val="Compact"/>
-              <w:jc w:val="center"/>
-            </w:pPr>
-            <w:r>
-              <w:t xml:space="preserve">☐</w:t>
+              <w:t xml:space="preserve">Tanium package</w:t>
+            </w:r>
+          </w:p>
+        </w:tc>
+        <w:tc>
+          <w:tcPr/>
+          <w:p>
+            <w:pPr>
+              <w:pStyle w:val="Compact"/>
+            </w:pPr>
+            <w:r>
+              <w:t xml:space="preserve">CSW download</w:t>
+            </w:r>
+          </w:p>
+        </w:tc>
+        <w:tc>
+          <w:tcPr/>
+          <w:p>
+            <w:pPr>
+              <w:pStyle w:val="Compact"/>
+            </w:pPr>
+            <w:r>
+              <w:t xml:space="preserve">Target group</w:t>
+            </w:r>
+          </w:p>
+        </w:tc>
+      </w:tr>
+      <w:tr>
+        <w:tc>
+          <w:tcPr/>
+          <w:p>
+            <w:pPr>
+              <w:pStyle w:val="Compact"/>
+            </w:pPr>
+            <w:r>
+              <w:t xml:space="preserve">CSW — Linux RHEL/Rocky (RPM)</w:t>
+            </w:r>
+          </w:p>
+        </w:tc>
+        <w:tc>
+          <w:tcPr/>
+          <w:p>
+            <w:pPr>
+              <w:pStyle w:val="Compact"/>
+            </w:pPr>
+            <w:r>
+              <w:t xml:space="preserve">OS Linux + RPM family</w:t>
+            </w:r>
+          </w:p>
+        </w:tc>
+        <w:tc>
+          <w:tcPr/>
+          <w:p>
+            <w:pPr>
+              <w:pStyle w:val="Compact"/>
+            </w:pPr>
+            <w:r>
+              <w:t xml:space="preserve">Linux RPM hosts only</w:t>
+            </w:r>
+          </w:p>
+        </w:tc>
+      </w:tr>
+      <w:tr>
+        <w:tc>
+          <w:tcPr/>
+          <w:p>
+            <w:pPr>
+              <w:pStyle w:val="Compact"/>
+            </w:pPr>
+            <w:r>
+              <w:t xml:space="preserve">CSW — Linux Ubuntu/Debian (DEB)</w:t>
+            </w:r>
+          </w:p>
+        </w:tc>
+        <w:tc>
+          <w:tcPr/>
+          <w:p>
+            <w:pPr>
+              <w:pStyle w:val="Compact"/>
+            </w:pPr>
+            <w:r>
+              <w:t xml:space="preserve">OS Linux + DEB family</w:t>
+            </w:r>
+          </w:p>
+        </w:tc>
+        <w:tc>
+          <w:tcPr/>
+          <w:p>
+            <w:pPr>
+              <w:pStyle w:val="Compact"/>
+            </w:pPr>
+            <w:r>
+              <w:t xml:space="preserve">Linux DEB hosts only</w:t>
+            </w:r>
+          </w:p>
+        </w:tc>
+      </w:tr>
+      <w:tr>
+        <w:tc>
+          <w:tcPr/>
+          <w:p>
+            <w:pPr>
+              <w:pStyle w:val="Compact"/>
+            </w:pPr>
+            <w:r>
+              <w:t xml:space="preserve">CSW — Windows</w:t>
+            </w:r>
+          </w:p>
+        </w:tc>
+        <w:tc>
+          <w:tcPr/>
+          <w:p>
+            <w:pPr>
+              <w:pStyle w:val="Compact"/>
+            </w:pPr>
+            <w:r>
+              <w:t xml:space="preserve">OS Windows + MSI ZIP</w:t>
+            </w:r>
+          </w:p>
+        </w:tc>
+        <w:tc>
+          <w:tcPr/>
+          <w:p>
+            <w:pPr>
+              <w:pStyle w:val="Compact"/>
+            </w:pPr>
+            <w:r>
+              <w:t xml:space="preserve">Windows hosts only</w:t>
             </w:r>
           </w:p>
         </w:tc>
@@ -1368,14 +1122,374 @@
         </w:pict>
       </w:r>
     </w:p>
-    <w:bookmarkEnd w:id="14"/>
-    <w:bookmarkStart w:id="15" w:name="post-deploy-verification"/>
+    <w:bookmarkEnd w:id="13"/>
+    <w:bookmarkStart w:id="14" w:name="X31f47590a34599c44f341f804583e251c2493c5"/>
     <w:p>
       <w:pPr>
         <w:pStyle w:val="Heading2"/>
       </w:pPr>
       <w:r>
-        <w:t xml:space="preserve">Post-deploy verification</w:t>
+        <w:t xml:space="preserve">Package contents (same folder on every endpoint — per OS package)</w:t>
+      </w:r>
+    </w:p>
+    <w:tbl>
+      <w:tblPr>
+        <w:tblStyle w:val="Table"/>
+        <w:tblW w:type="auto" w:w="0"/>
+        <w:tblLook w:firstRow="1" w:lastRow="0" w:firstColumn="0" w:lastColumn="0" w:noHBand="0" w:noVBand="0" w:val="0020"/>
+      </w:tblPr>
+      <w:tblGrid>
+        <w:gridCol w:w="3960"/>
+        <w:gridCol w:w="3960"/>
+      </w:tblGrid>
+      <w:tr>
+        <w:trPr>
+          <w:tblHeader w:val="on"/>
+        </w:trPr>
+        <w:tc>
+          <w:tcPr/>
+          <w:p>
+            <w:pPr>
+              <w:pStyle w:val="Compact"/>
+            </w:pPr>
+            <w:r>
+              <w:t xml:space="preserve">File</w:t>
+            </w:r>
+          </w:p>
+        </w:tc>
+        <w:tc>
+          <w:tcPr/>
+          <w:p>
+            <w:pPr>
+              <w:pStyle w:val="Compact"/>
+              <w:jc w:val="center"/>
+            </w:pPr>
+            <w:r>
+              <w:t xml:space="preserve">Required</w:t>
+            </w:r>
+          </w:p>
+        </w:tc>
+      </w:tr>
+      <w:tr>
+        <w:tc>
+          <w:tcPr/>
+          <w:p>
+            <w:pPr>
+              <w:pStyle w:val="Compact"/>
+            </w:pPr>
+            <w:r>
+              <w:rPr>
+                <w:rStyle w:val="VerbatimChar"/>
+                <w:b/>
+                <w:bCs/>
+              </w:rPr>
+              <w:t xml:space="preserve">user.cfg</w:t>
+            </w:r>
+            <w:r>
+              <w:t xml:space="preserve"> </w:t>
+            </w:r>
+            <w:r>
+              <w:t xml:space="preserve">(with</w:t>
+            </w:r>
+            <w:r>
+              <w:t xml:space="preserve"> </w:t>
+            </w:r>
+            <w:r>
+              <w:rPr>
+                <w:rStyle w:val="VerbatimChar"/>
+              </w:rPr>
+              <w:t xml:space="preserve">ACTIVATION_KEY</w:t>
+            </w:r>
+            <w:r>
+              <w:t xml:space="preserve"> </w:t>
+            </w:r>
+            <w:r>
+              <w:t xml:space="preserve">pre-staged)</w:t>
+            </w:r>
+          </w:p>
+        </w:tc>
+        <w:tc>
+          <w:tcPr/>
+          <w:p>
+            <w:pPr>
+              <w:pStyle w:val="Compact"/>
+              <w:jc w:val="center"/>
+            </w:pPr>
+            <w:r>
+              <w:rPr>
+                <w:b/>
+                <w:bCs/>
+              </w:rPr>
+              <w:t xml:space="preserve">Yes</w:t>
+            </w:r>
+          </w:p>
+        </w:tc>
+      </w:tr>
+      <w:tr>
+        <w:tc>
+          <w:tcPr/>
+          <w:p>
+            <w:pPr>
+              <w:pStyle w:val="Compact"/>
+            </w:pPr>
+            <w:r>
+              <w:rPr>
+                <w:rStyle w:val="VerbatimChar"/>
+              </w:rPr>
+              <w:t xml:space="preserve">ca.cert</w:t>
+            </w:r>
+          </w:p>
+        </w:tc>
+        <w:tc>
+          <w:tcPr/>
+          <w:p>
+            <w:pPr>
+              <w:pStyle w:val="Compact"/>
+              <w:jc w:val="center"/>
+            </w:pPr>
+            <w:r>
+              <w:t xml:space="preserve">Yes</w:t>
+            </w:r>
+          </w:p>
+        </w:tc>
+      </w:tr>
+      <w:tr>
+        <w:tc>
+          <w:tcPr/>
+          <w:p>
+            <w:pPr>
+              <w:pStyle w:val="Compact"/>
+            </w:pPr>
+            <w:r>
+              <w:rPr>
+                <w:rStyle w:val="VerbatimChar"/>
+              </w:rPr>
+              <w:t xml:space="preserve">site.cfg</w:t>
+            </w:r>
+          </w:p>
+        </w:tc>
+        <w:tc>
+          <w:tcPr/>
+          <w:p>
+            <w:pPr>
+              <w:pStyle w:val="Compact"/>
+              <w:jc w:val="center"/>
+            </w:pPr>
+            <w:r>
+              <w:t xml:space="preserve">Yes</w:t>
+            </w:r>
+          </w:p>
+        </w:tc>
+      </w:tr>
+      <w:tr>
+        <w:tc>
+          <w:tcPr/>
+          <w:p>
+            <w:pPr>
+              <w:pStyle w:val="Compact"/>
+            </w:pPr>
+            <w:r>
+              <w:rPr>
+                <w:rStyle w:val="VerbatimChar"/>
+              </w:rPr>
+              <w:t xml:space="preserve">sensor_config</w:t>
+            </w:r>
+          </w:p>
+        </w:tc>
+        <w:tc>
+          <w:tcPr/>
+          <w:p>
+            <w:pPr>
+              <w:pStyle w:val="Compact"/>
+              <w:jc w:val="center"/>
+            </w:pPr>
+            <w:r>
+              <w:t xml:space="preserve">Yes</w:t>
+            </w:r>
+          </w:p>
+        </w:tc>
+      </w:tr>
+      <w:tr>
+        <w:tc>
+          <w:tcPr/>
+          <w:p>
+            <w:pPr>
+              <w:pStyle w:val="Compact"/>
+            </w:pPr>
+            <w:r>
+              <w:rPr>
+                <w:rStyle w:val="VerbatimChar"/>
+              </w:rPr>
+              <w:t xml:space="preserve">sensor_type</w:t>
+            </w:r>
+          </w:p>
+        </w:tc>
+        <w:tc>
+          <w:tcPr/>
+          <w:p>
+            <w:pPr>
+              <w:pStyle w:val="Compact"/>
+              <w:jc w:val="center"/>
+            </w:pPr>
+            <w:r>
+              <w:t xml:space="preserve">Yes</w:t>
+            </w:r>
+          </w:p>
+        </w:tc>
+      </w:tr>
+      <w:tr>
+        <w:tc>
+          <w:tcPr/>
+          <w:p>
+            <w:pPr>
+              <w:pStyle w:val="Compact"/>
+            </w:pPr>
+            <w:r>
+              <w:rPr>
+                <w:rStyle w:val="VerbatimChar"/>
+              </w:rPr>
+              <w:t xml:space="preserve">enforcer.cfg</w:t>
+            </w:r>
+          </w:p>
+        </w:tc>
+        <w:tc>
+          <w:tcPr/>
+          <w:p>
+            <w:pPr>
+              <w:pStyle w:val="Compact"/>
+              <w:jc w:val="center"/>
+            </w:pPr>
+            <w:r>
+              <w:t xml:space="preserve">If enforcement</w:t>
+            </w:r>
+          </w:p>
+        </w:tc>
+      </w:tr>
+      <w:tr>
+        <w:tc>
+          <w:tcPr/>
+          <w:p>
+            <w:pPr>
+              <w:pStyle w:val="Compact"/>
+            </w:pPr>
+            <w:r>
+              <w:rPr>
+                <w:rStyle w:val="VerbatimChar"/>
+              </w:rPr>
+              <w:t xml:space="preserve">TetrationAgentInstaller.msi</w:t>
+            </w:r>
+            <w:r>
+              <w:t xml:space="preserve"> </w:t>
+            </w:r>
+            <w:r>
+              <w:t xml:space="preserve">(Windows) or</w:t>
+            </w:r>
+            <w:r>
+              <w:t xml:space="preserve"> </w:t>
+            </w:r>
+            <w:r>
+              <w:rPr>
+                <w:rStyle w:val="VerbatimChar"/>
+              </w:rPr>
+              <w:t xml:space="preserve">.rpm</w:t>
+            </w:r>
+            <w:r>
+              <w:t xml:space="preserve">/</w:t>
+            </w:r>
+            <w:r>
+              <w:rPr>
+                <w:rStyle w:val="VerbatimChar"/>
+              </w:rPr>
+              <w:t xml:space="preserve">.deb</w:t>
+            </w:r>
+            <w:r>
+              <w:t xml:space="preserve">/</w:t>
+            </w:r>
+            <w:r>
+              <w:rPr>
+                <w:rStyle w:val="VerbatimChar"/>
+              </w:rPr>
+              <w:t xml:space="preserve">.sh</w:t>
+            </w:r>
+            <w:r>
+              <w:t xml:space="preserve"> </w:t>
+            </w:r>
+            <w:r>
+              <w:t xml:space="preserve">(Linux)</w:t>
+            </w:r>
+          </w:p>
+        </w:tc>
+        <w:tc>
+          <w:tcPr/>
+          <w:p>
+            <w:pPr>
+              <w:pStyle w:val="Compact"/>
+              <w:jc w:val="center"/>
+            </w:pPr>
+            <w:r>
+              <w:t xml:space="preserve">Yes</w:t>
+            </w:r>
+          </w:p>
+        </w:tc>
+      </w:tr>
+    </w:tbl>
+    <w:p>
+      <w:pPr>
+        <w:pStyle w:val="BodyText"/>
+      </w:pPr>
+      <w:r>
+        <w:rPr>
+          <w:b/>
+          <w:bCs/>
+        </w:rPr>
+        <w:t xml:space="preserve">Suggested paths:</w:t>
+      </w:r>
+      <w:r>
+        <w:t xml:space="preserve"> </w:t>
+      </w:r>
+      <w:r>
+        <w:t xml:space="preserve">Linux</w:t>
+      </w:r>
+      <w:r>
+        <w:t xml:space="preserve"> </w:t>
+      </w:r>
+      <w:r>
+        <w:rPr>
+          <w:rStyle w:val="VerbatimChar"/>
+        </w:rPr>
+        <w:t xml:space="preserve">/opt/tanium/csw/</w:t>
+      </w:r>
+      <w:r>
+        <w:t xml:space="preserve"> </w:t>
+      </w:r>
+      <w:r>
+        <w:t xml:space="preserve">· Windows</w:t>
+      </w:r>
+      <w:r>
+        <w:t xml:space="preserve"> </w:t>
+      </w:r>
+      <w:r>
+        <w:rPr>
+          <w:rStyle w:val="VerbatimChar"/>
+        </w:rPr>
+        <w:t xml:space="preserve">C:\Program Files\Tanium\csw\</w:t>
+      </w:r>
+    </w:p>
+    <w:p>
+      <w:r>
+        <w:pict>
+          <v:rect style="width:0;height:1.5pt" o:hralign="center" o:hrstd="t" o:hr="t"/>
+        </w:pict>
+      </w:r>
+    </w:p>
+    <w:bookmarkEnd w:id="14"/>
+    <w:bookmarkStart w:id="15" w:name="X90a02fb555be32b0e25dbfe708ee91edbaad061"/>
+    <w:p>
+      <w:pPr>
+        <w:pStyle w:val="Heading2"/>
+      </w:pPr>
+      <w:r>
+        <w:t xml:space="preserve">Tanium Deploy package steps (order matters)</w:t>
       </w:r>
     </w:p>
     <w:tbl>
@@ -1400,128 +1514,371 @@
               <w:pStyle w:val="Compact"/>
             </w:pPr>
             <w:r>
-              <w:t xml:space="preserve">Check</w:t>
-            </w:r>
-          </w:p>
-        </w:tc>
-        <w:tc>
-          <w:tcPr/>
-          <w:p>
-            <w:pPr>
-              <w:pStyle w:val="Compact"/>
-            </w:pPr>
-            <w:r>
-              <w:t xml:space="preserve">Linux</w:t>
-            </w:r>
-          </w:p>
-        </w:tc>
-        <w:tc>
-          <w:tcPr/>
-          <w:p>
-            <w:pPr>
-              <w:pStyle w:val="Compact"/>
-            </w:pPr>
-            <w:r>
-              <w:t xml:space="preserve">Windows</w:t>
-            </w:r>
-          </w:p>
-        </w:tc>
-      </w:tr>
-      <w:tr>
-        <w:tc>
-          <w:tcPr/>
-          <w:p>
-            <w:pPr>
-              <w:pStyle w:val="Compact"/>
-            </w:pPr>
-            <w:r>
-              <w:t xml:space="preserve">Service running</w:t>
-            </w:r>
-          </w:p>
-        </w:tc>
-        <w:tc>
-          <w:tcPr/>
-          <w:p>
-            <w:pPr>
-              <w:pStyle w:val="Compact"/>
-            </w:pPr>
-            <w:r>
-              <w:rPr>
-                <w:rStyle w:val="VerbatimChar"/>
-              </w:rPr>
-              <w:t xml:space="preserve">systemctl is-active csw-agent</w:t>
-            </w:r>
-          </w:p>
-        </w:tc>
-        <w:tc>
-          <w:tcPr/>
-          <w:p>
-            <w:pPr>
-              <w:pStyle w:val="Compact"/>
-            </w:pPr>
-            <w:r>
-              <w:rPr>
-                <w:rStyle w:val="VerbatimChar"/>
-              </w:rPr>
-              <w:t xml:space="preserve">Get-Service CswAgent</w:t>
-            </w:r>
-          </w:p>
-        </w:tc>
-      </w:tr>
-      <w:tr>
-        <w:tc>
-          <w:tcPr/>
-          <w:p>
-            <w:pPr>
-              <w:pStyle w:val="Compact"/>
-            </w:pPr>
-            <w:r>
-              <w:t xml:space="preserve">CSW UI</w:t>
-            </w:r>
-          </w:p>
-        </w:tc>
-        <w:tc>
-          <w:tcPr/>
-          <w:p>
-            <w:pPr>
-              <w:pStyle w:val="Compact"/>
-            </w:pPr>
-            <w:r>
-              <w:rPr>
-                <w:i/>
-                <w:iCs/>
-              </w:rPr>
-              <w:t xml:space="preserve">Manage → Agents → Software Agents</w:t>
-            </w:r>
-            <w:r>
-              <w:t xml:space="preserve"> </w:t>
-            </w:r>
-            <w:r>
-              <w:t xml:space="preserve">— status</w:t>
-            </w:r>
-            <w:r>
-              <w:t xml:space="preserve"> </w:t>
-            </w:r>
+              <w:t xml:space="preserve">#</w:t>
+            </w:r>
+          </w:p>
+        </w:tc>
+        <w:tc>
+          <w:tcPr/>
+          <w:p>
+            <w:pPr>
+              <w:pStyle w:val="Compact"/>
+            </w:pPr>
+            <w:r>
+              <w:t xml:space="preserve">Package step</w:t>
+            </w:r>
+          </w:p>
+        </w:tc>
+        <w:tc>
+          <w:tcPr/>
+          <w:p>
+            <w:pPr>
+              <w:pStyle w:val="Compact"/>
+              <w:jc w:val="center"/>
+            </w:pPr>
+            <w:r>
+              <w:t xml:space="preserve">Done</w:t>
+            </w:r>
+          </w:p>
+        </w:tc>
+      </w:tr>
+      <w:tr>
+        <w:tc>
+          <w:tcPr/>
+          <w:p>
+            <w:pPr>
+              <w:pStyle w:val="Compact"/>
+            </w:pPr>
+            <w:r>
+              <w:t xml:space="preserve">1</w:t>
+            </w:r>
+          </w:p>
+        </w:tc>
+        <w:tc>
+          <w:tcPr/>
+          <w:p>
+            <w:pPr>
+              <w:pStyle w:val="Compact"/>
+            </w:pPr>
             <w:r>
               <w:rPr>
                 <w:b/>
                 <w:bCs/>
               </w:rPr>
+              <w:t xml:space="preserve">Stage</w:t>
+            </w:r>
+            <w:r>
+              <w:rPr>
+                <w:b/>
+                <w:bCs/>
+              </w:rPr>
+              <w:t xml:space="preserve"> </w:t>
+            </w:r>
+            <w:r>
+              <w:rPr>
+                <w:rStyle w:val="VerbatimChar"/>
+                <w:b/>
+                <w:bCs/>
+              </w:rPr>
+              <w:t xml:space="preserve">user.cfg</w:t>
+            </w:r>
+            <w:r>
+              <w:t xml:space="preserve"> </w:t>
+            </w:r>
+            <w:r>
+              <w:t xml:space="preserve">— run</w:t>
+            </w:r>
+            <w:r>
+              <w:t xml:space="preserve"> </w:t>
+            </w:r>
+            <w:r>
+              <w:rPr>
+                <w:rStyle w:val="VerbatimChar"/>
+              </w:rPr>
+              <w:t xml:space="preserve">stage-user-cfg</w:t>
+            </w:r>
+            <w:r>
+              <w:t xml:space="preserve"> </w:t>
+            </w:r>
+            <w:r>
+              <w:t xml:space="preserve">script with</w:t>
+            </w:r>
+            <w:r>
+              <w:t xml:space="preserve"> </w:t>
+            </w:r>
+            <w:r>
+              <w:rPr>
+                <w:rStyle w:val="VerbatimChar"/>
+              </w:rPr>
+              <w:t xml:space="preserve">CSW_ACTIVATION_KEY</w:t>
+            </w:r>
+            <w:r>
+              <w:t xml:space="preserve"> </w:t>
+            </w:r>
+            <w:r>
+              <w:t xml:space="preserve">from Tanium variable</w:t>
+            </w:r>
+          </w:p>
+        </w:tc>
+        <w:tc>
+          <w:tcPr/>
+          <w:p>
+            <w:pPr>
+              <w:pStyle w:val="Compact"/>
+              <w:jc w:val="center"/>
+            </w:pPr>
+            <w:r>
+              <w:t xml:space="preserve">☐</w:t>
+            </w:r>
+          </w:p>
+        </w:tc>
+      </w:tr>
+      <w:tr>
+        <w:tc>
+          <w:tcPr/>
+          <w:p>
+            <w:pPr>
+              <w:pStyle w:val="Compact"/>
+            </w:pPr>
+            <w:r>
+              <w:t xml:space="preserve">2</w:t>
+            </w:r>
+          </w:p>
+        </w:tc>
+        <w:tc>
+          <w:tcPr/>
+          <w:p>
+            <w:pPr>
+              <w:pStyle w:val="Compact"/>
+            </w:pPr>
+            <w:r>
+              <w:t xml:space="preserve">Deploy full Cisco bundle (site files + installer) to install directory</w:t>
+            </w:r>
+          </w:p>
+        </w:tc>
+        <w:tc>
+          <w:tcPr/>
+          <w:p>
+            <w:pPr>
+              <w:pStyle w:val="Compact"/>
+              <w:jc w:val="center"/>
+            </w:pPr>
+            <w:r>
+              <w:t xml:space="preserve">☐</w:t>
+            </w:r>
+          </w:p>
+        </w:tc>
+      </w:tr>
+      <w:tr>
+        <w:tc>
+          <w:tcPr/>
+          <w:p>
+            <w:pPr>
+              <w:pStyle w:val="Compact"/>
+            </w:pPr>
+            <w:r>
+              <w:t xml:space="preserve">3</w:t>
+            </w:r>
+          </w:p>
+        </w:tc>
+        <w:tc>
+          <w:tcPr/>
+          <w:p>
+            <w:pPr>
+              <w:pStyle w:val="Compact"/>
+            </w:pPr>
+            <w:r>
+              <w:rPr>
+                <w:b/>
+                <w:bCs/>
+              </w:rPr>
+              <w:t xml:space="preserve">Install</w:t>
+            </w:r>
+            <w:r>
+              <w:t xml:space="preserve"> </w:t>
+            </w:r>
+            <w:r>
+              <w:t xml:space="preserve">— Linux:</w:t>
+            </w:r>
+            <w:r>
+              <w:t xml:space="preserve"> </w:t>
+            </w:r>
+            <w:r>
+              <w:rPr>
+                <w:rStyle w:val="VerbatimChar"/>
+              </w:rPr>
+              <w:t xml:space="preserve">tanium-linux-install.sh</w:t>
+            </w:r>
+            <w:r>
+              <w:t xml:space="preserve"> </w:t>
+            </w:r>
+            <w:r>
+              <w:t xml:space="preserve">· Windows:</w:t>
+            </w:r>
+            <w:r>
+              <w:t xml:space="preserve"> </w:t>
+            </w:r>
+            <w:r>
+              <w:rPr>
+                <w:rStyle w:val="VerbatimChar"/>
+              </w:rPr>
+              <w:t xml:space="preserve">tanium-windows-install.ps1</w:t>
+            </w:r>
+          </w:p>
+        </w:tc>
+        <w:tc>
+          <w:tcPr/>
+          <w:p>
+            <w:pPr>
+              <w:pStyle w:val="Compact"/>
+              <w:jc w:val="center"/>
+            </w:pPr>
+            <w:r>
+              <w:t xml:space="preserve">☐</w:t>
+            </w:r>
+          </w:p>
+        </w:tc>
+      </w:tr>
+      <w:tr>
+        <w:tc>
+          <w:tcPr/>
+          <w:p>
+            <w:pPr>
+              <w:pStyle w:val="Compact"/>
+            </w:pPr>
+            <w:r>
+              <w:t xml:space="preserve">4</w:t>
+            </w:r>
+          </w:p>
+        </w:tc>
+        <w:tc>
+          <w:tcPr/>
+          <w:p>
+            <w:pPr>
+              <w:pStyle w:val="Compact"/>
+            </w:pPr>
+            <w:r>
+              <w:t xml:space="preserve">Success criteria: exit code</w:t>
+            </w:r>
+            <w:r>
+              <w:t xml:space="preserve"> </w:t>
+            </w:r>
+            <w:r>
+              <w:rPr>
+                <w:b/>
+                <w:bCs/>
+              </w:rPr>
+              <w:t xml:space="preserve">0</w:t>
+            </w:r>
+            <w:r>
+              <w:t xml:space="preserve"> </w:t>
+            </w:r>
+            <w:r>
+              <w:t xml:space="preserve">+ service</w:t>
+            </w:r>
+            <w:r>
+              <w:t xml:space="preserve"> </w:t>
+            </w:r>
+            <w:r>
+              <w:rPr>
+                <w:b/>
+                <w:bCs/>
+              </w:rPr>
               <w:t xml:space="preserve">Running</w:t>
             </w:r>
             <w:r>
-              <w:t xml:space="preserve">, correct scope</w:t>
-            </w:r>
-          </w:p>
-        </w:tc>
-        <w:tc>
-          <w:tcPr/>
-          <w:p>
-            <w:pPr>
-              <w:pStyle w:val="Compact"/>
-            </w:pPr>
-            <w:r>
-              <w:t xml:space="preserve">Same</w:t>
+              <w:t xml:space="preserve"> </w:t>
+            </w:r>
+            <w:r>
+              <w:t xml:space="preserve">(</w:t>
+            </w:r>
+            <w:r>
+              <w:rPr>
+                <w:rStyle w:val="VerbatimChar"/>
+              </w:rPr>
+              <w:t xml:space="preserve">csw-agent</w:t>
+            </w:r>
+            <w:r>
+              <w:t xml:space="preserve"> </w:t>
+            </w:r>
+            <w:r>
+              <w:t xml:space="preserve">/</w:t>
+            </w:r>
+            <w:r>
+              <w:t xml:space="preserve"> </w:t>
+            </w:r>
+            <w:r>
+              <w:rPr>
+                <w:rStyle w:val="VerbatimChar"/>
+              </w:rPr>
+              <w:t xml:space="preserve">CswAgent</w:t>
+            </w:r>
+            <w:r>
+              <w:t xml:space="preserve">)</w:t>
+            </w:r>
+          </w:p>
+        </w:tc>
+        <w:tc>
+          <w:tcPr/>
+          <w:p>
+            <w:pPr>
+              <w:pStyle w:val="Compact"/>
+              <w:jc w:val="center"/>
+            </w:pPr>
+            <w:r>
+              <w:t xml:space="preserve">☐</w:t>
+            </w:r>
+          </w:p>
+        </w:tc>
+      </w:tr>
+      <w:tr>
+        <w:tc>
+          <w:tcPr/>
+          <w:p>
+            <w:pPr>
+              <w:pStyle w:val="Compact"/>
+            </w:pPr>
+            <w:r>
+              <w:t xml:space="preserve">5</w:t>
+            </w:r>
+          </w:p>
+        </w:tc>
+        <w:tc>
+          <w:tcPr/>
+          <w:p>
+            <w:pPr>
+              <w:pStyle w:val="Compact"/>
+            </w:pPr>
+            <w:r>
+              <w:t xml:space="preserve">Pilot wave → production waves; confirm CSW UI shows host</w:t>
+            </w:r>
+            <w:r>
+              <w:t xml:space="preserve"> </w:t>
+            </w:r>
+            <w:r>
+              <w:rPr>
+                <w:b/>
+                <w:bCs/>
+              </w:rPr>
+              <w:t xml:space="preserve">Running</w:t>
+            </w:r>
+            <w:r>
+              <w:t xml:space="preserve"> </w:t>
+            </w:r>
+            <w:r>
+              <w:t xml:space="preserve">within 1–2 min</w:t>
+            </w:r>
+          </w:p>
+        </w:tc>
+        <w:tc>
+          <w:tcPr/>
+          <w:p>
+            <w:pPr>
+              <w:pStyle w:val="Compact"/>
+              <w:jc w:val="center"/>
+            </w:pPr>
+            <w:r>
+              <w:t xml:space="preserve">☐</w:t>
             </w:r>
           </w:p>
         </w:tc>
@@ -1535,16 +1892,182 @@
       </w:r>
     </w:p>
     <w:bookmarkEnd w:id="15"/>
-    <w:bookmarkStart w:id="21" w:name="if-something-fails"/>
+    <w:bookmarkStart w:id="16" w:name="post-deploy-verification"/>
     <w:p>
       <w:pPr>
         <w:pStyle w:val="Heading2"/>
       </w:pPr>
       <w:r>
+        <w:t xml:space="preserve">Post-deploy verification</w:t>
+      </w:r>
+    </w:p>
+    <w:tbl>
+      <w:tblPr>
+        <w:tblStyle w:val="Table"/>
+        <w:tblW w:type="auto" w:w="0"/>
+        <w:tblLook w:firstRow="1" w:lastRow="0" w:firstColumn="0" w:lastColumn="0" w:noHBand="0" w:noVBand="0" w:val="0020"/>
+      </w:tblPr>
+      <w:tblGrid>
+        <w:gridCol w:w="2640"/>
+        <w:gridCol w:w="2640"/>
+        <w:gridCol w:w="2640"/>
+      </w:tblGrid>
+      <w:tr>
+        <w:trPr>
+          <w:tblHeader w:val="on"/>
+        </w:trPr>
+        <w:tc>
+          <w:tcPr/>
+          <w:p>
+            <w:pPr>
+              <w:pStyle w:val="Compact"/>
+            </w:pPr>
+            <w:r>
+              <w:t xml:space="preserve">Check</w:t>
+            </w:r>
+          </w:p>
+        </w:tc>
+        <w:tc>
+          <w:tcPr/>
+          <w:p>
+            <w:pPr>
+              <w:pStyle w:val="Compact"/>
+            </w:pPr>
+            <w:r>
+              <w:t xml:space="preserve">Linux</w:t>
+            </w:r>
+          </w:p>
+        </w:tc>
+        <w:tc>
+          <w:tcPr/>
+          <w:p>
+            <w:pPr>
+              <w:pStyle w:val="Compact"/>
+            </w:pPr>
+            <w:r>
+              <w:t xml:space="preserve">Windows</w:t>
+            </w:r>
+          </w:p>
+        </w:tc>
+      </w:tr>
+      <w:tr>
+        <w:tc>
+          <w:tcPr/>
+          <w:p>
+            <w:pPr>
+              <w:pStyle w:val="Compact"/>
+            </w:pPr>
+            <w:r>
+              <w:t xml:space="preserve">Service running</w:t>
+            </w:r>
+          </w:p>
+        </w:tc>
+        <w:tc>
+          <w:tcPr/>
+          <w:p>
+            <w:pPr>
+              <w:pStyle w:val="Compact"/>
+            </w:pPr>
+            <w:r>
+              <w:rPr>
+                <w:rStyle w:val="VerbatimChar"/>
+              </w:rPr>
+              <w:t xml:space="preserve">systemctl is-active csw-agent</w:t>
+            </w:r>
+          </w:p>
+        </w:tc>
+        <w:tc>
+          <w:tcPr/>
+          <w:p>
+            <w:pPr>
+              <w:pStyle w:val="Compact"/>
+            </w:pPr>
+            <w:r>
+              <w:rPr>
+                <w:rStyle w:val="VerbatimChar"/>
+              </w:rPr>
+              <w:t xml:space="preserve">Get-Service CswAgent</w:t>
+            </w:r>
+          </w:p>
+        </w:tc>
+      </w:tr>
+      <w:tr>
+        <w:tc>
+          <w:tcPr/>
+          <w:p>
+            <w:pPr>
+              <w:pStyle w:val="Compact"/>
+            </w:pPr>
+            <w:r>
+              <w:t xml:space="preserve">CSW UI</w:t>
+            </w:r>
+          </w:p>
+        </w:tc>
+        <w:tc>
+          <w:tcPr/>
+          <w:p>
+            <w:pPr>
+              <w:pStyle w:val="Compact"/>
+            </w:pPr>
+            <w:r>
+              <w:rPr>
+                <w:i/>
+                <w:iCs/>
+              </w:rPr>
+              <w:t xml:space="preserve">Manage → Agents → Software Agents</w:t>
+            </w:r>
+            <w:r>
+              <w:t xml:space="preserve"> </w:t>
+            </w:r>
+            <w:r>
+              <w:t xml:space="preserve">— status</w:t>
+            </w:r>
+            <w:r>
+              <w:t xml:space="preserve"> </w:t>
+            </w:r>
+            <w:r>
+              <w:rPr>
+                <w:b/>
+                <w:bCs/>
+              </w:rPr>
+              <w:t xml:space="preserve">Running</w:t>
+            </w:r>
+            <w:r>
+              <w:t xml:space="preserve">, correct scope</w:t>
+            </w:r>
+          </w:p>
+        </w:tc>
+        <w:tc>
+          <w:tcPr/>
+          <w:p>
+            <w:pPr>
+              <w:pStyle w:val="Compact"/>
+            </w:pPr>
+            <w:r>
+              <w:t xml:space="preserve">Same</w:t>
+            </w:r>
+          </w:p>
+        </w:tc>
+      </w:tr>
+    </w:tbl>
+    <w:p>
+      <w:r>
+        <w:pict>
+          <v:rect style="width:0;height:1.5pt" o:hralign="center" o:hrstd="t" o:hr="t"/>
+        </w:pict>
+      </w:r>
+    </w:p>
+    <w:bookmarkEnd w:id="16"/>
+    <w:bookmarkStart w:id="22" w:name="if-something-fails"/>
+    <w:p>
+      <w:pPr>
+        <w:pStyle w:val="Heading2"/>
+      </w:pPr>
+      <w:r>
         <w:t xml:space="preserve">If something fails</w:t>
       </w:r>
     </w:p>
-    <w:bookmarkStart w:id="16" w:name="all-platforms-tanium"/>
+    <w:bookmarkStart w:id="17" w:name="all-platforms-tanium"/>
     <w:p>
       <w:pPr>
         <w:pStyle w:val="Heading3"/>
@@ -1738,9 +2261,90 @@
           </w:p>
         </w:tc>
       </w:tr>
+      <w:tr>
+        <w:tc>
+          <w:tcPr/>
+          <w:p>
+            <w:pPr>
+              <w:pStyle w:val="Compact"/>
+            </w:pPr>
+            <w:r>
+              <w:t xml:space="preserve">Linux hosts get Windows MSI (or vice versa)</w:t>
+            </w:r>
+          </w:p>
+        </w:tc>
+        <w:tc>
+          <w:tcPr/>
+          <w:p>
+            <w:pPr>
+              <w:pStyle w:val="Compact"/>
+            </w:pPr>
+            <w:r>
+              <w:t xml:space="preserve">Wrong package targeted</w:t>
+            </w:r>
+          </w:p>
+        </w:tc>
+      </w:tr>
+      <w:tr>
+        <w:tc>
+          <w:tcPr/>
+          <w:p>
+            <w:pPr>
+              <w:pStyle w:val="Compact"/>
+            </w:pPr>
+            <w:r>
+              <w:rPr>
+                <w:rStyle w:val="VerbatimChar"/>
+              </w:rPr>
+              <w:t xml:space="preserve">OS not supported</w:t>
+            </w:r>
+            <w:r>
+              <w:t xml:space="preserve"> </w:t>
+            </w:r>
+            <w:r>
+              <w:t xml:space="preserve">on Linux</w:t>
+            </w:r>
+          </w:p>
+        </w:tc>
+        <w:tc>
+          <w:tcPr/>
+          <w:p>
+            <w:pPr>
+              <w:pStyle w:val="Compact"/>
+            </w:pPr>
+            <w:r>
+              <w:rPr>
+                <w:rStyle w:val="VerbatimChar"/>
+              </w:rPr>
+              <w:t xml:space="preserve">.deb</w:t>
+            </w:r>
+            <w:r>
+              <w:t xml:space="preserve"> </w:t>
+            </w:r>
+            <w:r>
+              <w:t xml:space="preserve">sent to RHEL or</w:t>
+            </w:r>
+            <w:r>
+              <w:t xml:space="preserve"> </w:t>
+            </w:r>
+            <w:r>
+              <w:rPr>
+                <w:rStyle w:val="VerbatimChar"/>
+              </w:rPr>
+              <w:t xml:space="preserve">.rpm</w:t>
+            </w:r>
+            <w:r>
+              <w:t xml:space="preserve"> </w:t>
+            </w:r>
+            <w:r>
+              <w:t xml:space="preserve">to Ubuntu</w:t>
+            </w:r>
+          </w:p>
+        </w:tc>
+      </w:tr>
     </w:tbl>
-    <w:bookmarkEnd w:id="16"/>
-    <w:bookmarkStart w:id="17" w:name="linux"/>
+    <w:bookmarkEnd w:id="17"/>
+    <w:bookmarkStart w:id="18" w:name="linux"/>
     <w:p>
       <w:pPr>
         <w:pStyle w:val="Heading3"/>
@@ -1946,8 +2550,8 @@
         </w:tc>
       </w:tr>
     </w:tbl>
-    <w:bookmarkEnd w:id="17"/>
-    <w:bookmarkStart w:id="20" w:name="windows"/>
+    <w:bookmarkEnd w:id="18"/>
+    <w:bookmarkStart w:id="21" w:name="windows"/>
     <w:p>
       <w:pPr>
         <w:pStyle w:val="Heading3"/>
@@ -2167,7 +2771,7 @@
       <w:r>
         <w:t xml:space="preserve"> </w:t>
       </w:r>
-      <w:hyperlink r:id="rId18">
+      <w:hyperlink r:id="rId19">
         <w:r>
           <w:rPr>
             <w:rStyle w:val="VerbatimChar"/>
@@ -2184,7 +2788,7 @@
       <w:r>
         <w:t xml:space="preserve"> </w:t>
       </w:r>
-      <w:hyperlink r:id="rId19">
+      <w:hyperlink r:id="rId20">
         <w:r>
           <w:rPr>
             <w:rStyle w:val="VerbatimChar"/>
@@ -2212,8 +2816,8 @@
         <w:t xml:space="preserve">Draft v1 — cross-check against the Cisco Secure Workload User Guide for your release before production use.</w:t>
       </w:r>
     </w:p>
-    <w:bookmarkEnd w:id="20"/>
     <w:bookmarkEnd w:id="21"/>
+    <w:bookmarkEnd w:id="22"/>
     <w:sectPr>
       <w:footnotePr>
         <w:numRestart w:val="eachSect"/>

</xml_diff>